<commit_message>
Network Hardening, incident report
</commit_message>
<xml_diff>
--- a/Information Systems/GenAI LLM.docx
+++ b/Information Systems/GenAI LLM.docx
@@ -2,50 +2,1344 @@
 <file path=word/document.xml><?xml version="1.0" encoding="utf-8"?>
 <w:document xmlns:wpc="http://schemas.microsoft.com/office/word/2010/wordprocessingCanvas" xmlns:cx="http://schemas.microsoft.com/office/drawing/2014/chartex" xmlns:cx1="http://schemas.microsoft.com/office/drawing/2015/9/8/chartex" xmlns:cx2="http://schemas.microsoft.com/office/drawing/2015/10/21/chartex" xmlns:cx3="http://schemas.microsoft.com/office/drawing/2016/5/9/chartex" xmlns:cx4="http://schemas.microsoft.com/office/drawing/2016/5/10/chartex" xmlns:cx5="http://schemas.microsoft.com/office/drawing/2016/5/11/chartex" xmlns:cx6="http://schemas.microsoft.com/office/drawing/2016/5/12/chartex" xmlns:cx7="http://schemas.microsoft.com/office/drawing/2016/5/13/chartex" xmlns:cx8="http://schemas.microsoft.com/office/drawing/2016/5/14/chartex" xmlns:mc="http://schemas.openxmlformats.org/markup-compatibility/2006" xmlns:aink="http://schemas.microsoft.com/office/drawing/2016/ink" xmlns:am3d="http://schemas.microsoft.com/office/drawing/2017/model3d" xmlns:o="urn:schemas-microsoft-com:office:office" xmlns:oel="http://schemas.microsoft.com/office/2019/extlst" xmlns:r="http://schemas.openxmlformats.org/officeDocument/2006/relationships" xmlns:m="http://schemas.openxmlformats.org/officeDocument/2006/math" xmlns:v="urn:schemas-microsoft-com:vml" xmlns:wp14="http://schemas.microsoft.com/office/word/2010/wordprocessingDrawing" xmlns:wp="http://schemas.openxmlformats.org/drawingml/2006/wordprocessingDrawing" xmlns:w10="urn:schemas-microsoft-com:office:word" xmlns:w="http://schemas.openxmlformats.org/wordprocessingml/2006/main" xmlns:w14="http://schemas.microsoft.com/office/word/2010/wordml" xmlns:w15="http://schemas.microsoft.com/office/word/2012/wordml" xmlns:w16cex="http://schemas.microsoft.com/office/word/2018/wordml/cex" xmlns:w16cid="http://schemas.microsoft.com/office/word/2016/wordml/cid" xmlns:w16="http://schemas.microsoft.com/office/word/2018/wordml" xmlns:w16du="http://schemas.microsoft.com/office/word/2023/wordml/word16du" xmlns:w16sdtdh="http://schemas.microsoft.com/office/word/2020/wordml/sdtdatahash" xmlns:w16sdtfl="http://schemas.microsoft.com/office/word/2024/wordml/sdtformatlock" xmlns:w16se="http://schemas.microsoft.com/office/word/2015/wordml/symex" xmlns:wpg="http://schemas.microsoft.com/office/word/2010/wordprocessingGroup" xmlns:wpi="http://schemas.microsoft.com/office/word/2010/wordprocessingInk" xmlns:wne="http://schemas.microsoft.com/office/word/2006/wordml" xmlns:wps="http://schemas.microsoft.com/office/word/2010/wordprocessingShape" mc:Ignorable="w14 w15 w16se w16cid w16 w16cex w16sdtdh w16sdtfl w16du wp14">
   <w:body>
-    <w:p>
-      <w:r>
-        <w:t>GenAI LLM/Foundation Model (ChatGPT) Hands-On Exercise </w:t>
+    <w:p/>
+    <w:p>
+      <w:r>
+        <w:t xml:space="preserve">GenAI functions based on huge amounts of data that </w:t>
+      </w:r>
+      <w:r>
+        <w:t>are</w:t>
+      </w:r>
+      <w:r>
+        <w:t xml:space="preserve"> pulled from various sources </w:t>
+      </w:r>
+      <w:r>
+        <w:t>(</w:t>
+      </w:r>
+      <w:r>
+        <w:t xml:space="preserve">books, websites, images, </w:t>
+      </w:r>
+      <w:r>
+        <w:t xml:space="preserve">etc.) that are used to train the </w:t>
+      </w:r>
+      <w:r>
+        <w:t>model.</w:t>
+      </w:r>
+      <w:r>
+        <w:t xml:space="preserve"> With this data</w:t>
+      </w:r>
+      <w:r>
+        <w:t>,</w:t>
+      </w:r>
+      <w:r>
+        <w:t xml:space="preserve"> it learns patterns and different relationships in the data so it can perform whatever </w:t>
+      </w:r>
+      <w:r>
+        <w:t xml:space="preserve">prompt it is given by the user. It doesn’t understand its own output and has absolutely no awareness or comprehension. It simply just answers based on the patterns it already knows. </w:t>
+      </w:r>
+      <w:r>
+        <w:t>Actually,</w:t>
+      </w:r>
+      <w:r>
+        <w:t xml:space="preserve"> developing a GenAI model starts after the model is trained with </w:t>
+      </w:r>
+      <w:r>
+        <w:t xml:space="preserve">a </w:t>
+      </w:r>
+      <w:r>
+        <w:t>dataset. All this data has to be cleaned and format</w:t>
+      </w:r>
+      <w:r>
+        <w:t>ted properly to be fed to the model. It learns by slightly adjusting its parameters to reduce errors in the next word or image. Once fully trained it is usually finetuned for dedicated reasons.</w:t>
+      </w:r>
+      <w:r>
+        <w:t xml:space="preserve"> I like to think of this as the different models ChatGPT offers for different tasks (writing, problem solving, etc.).</w:t>
+      </w:r>
+      <w:r>
+        <w:t xml:space="preserve"> Usually, these models will be deployed through an API and integrated with a chatbot or writing assistant. Again, these models appear intelligent but really are just running off relationships and patterns found between massive sets of data.  The final step would be to fix</w:t>
+      </w:r>
+      <w:r>
+        <w:t xml:space="preserve"> any bugs with the model, improve the responses, and improve it based on feedback taken from users. </w:t>
+      </w:r>
+    </w:p>
+    <w:p/>
+    <w:p>
+      <w:r>
+        <w:t>In order to use ChatGPT responsibly, we can use it to explain concepts further and help us on practice problems. It’s great at creating quizzes as well that can help you study further. On the other hand, the wrong way to use it would be copying graded assignments or tests unless specifically told to do so. You don’t get anything out of it</w:t>
+      </w:r>
+      <w:r>
+        <w:t>,</w:t>
+      </w:r>
+      <w:r>
+        <w:t xml:space="preserve"> and this is exactly what academic dishonesty is. </w:t>
+      </w:r>
+      <w:r>
+        <w:t>Another super beneficial way to use it would be to ask it advice on what you can do to improve one of your essays. It’ll catch small grammatical errors and most of the time will recommend what you’re missing. With all of this comes prompting the AI to do what you want. Being clear with your input will improve the output and what information you get out of the model. Using it ethically means using it in honest and responsible ways. Being honest about our work and whether it is AI generated is an example of using AI ethically. Another way is to avoid sharing personal information in responses</w:t>
+      </w:r>
+      <w:r>
+        <w:t>. I think the most important part is to simply think for yourself first and use it as a learning tool after. Not just using it to copy and paste questions and answers.</w:t>
+      </w:r>
+    </w:p>
+    <w:p>
+      <w:pPr>
+        <w:rPr>
+          <w:b/>
+          <w:bCs/>
+          <w:sz w:val="28"/>
+          <w:szCs w:val="28"/>
+        </w:rPr>
+      </w:pPr>
+      <w:r>
+        <w:rPr>
+          <w:b/>
+          <w:bCs/>
+          <w:sz w:val="28"/>
+          <w:szCs w:val="28"/>
+        </w:rPr>
+        <w:t>Part 2</w:t>
+      </w:r>
+    </w:p>
+    <w:p>
+      <w:pPr>
+        <w:rPr>
+          <w:b/>
+          <w:bCs/>
+          <w:color w:val="0F9ED5" w:themeColor="accent4"/>
+          <w:sz w:val="28"/>
+          <w:szCs w:val="28"/>
+        </w:rPr>
+      </w:pPr>
+      <w:r>
+        <w:rPr>
+          <w:b/>
+          <w:bCs/>
+          <w:color w:val="0F9ED5" w:themeColor="accent4"/>
+          <w:sz w:val="28"/>
+          <w:szCs w:val="28"/>
+        </w:rPr>
+        <w:t>How many grams of protein does a cat need to eat every day?</w:t>
+      </w:r>
+    </w:p>
+    <w:p>
+      <w:pPr>
+        <w:rPr>
+          <w:b/>
+          <w:bCs/>
+          <w:color w:val="000000" w:themeColor="text1"/>
+        </w:rPr>
+      </w:pPr>
+      <w:r>
+        <w:rPr>
+          <w:b/>
+          <w:bCs/>
+          <w:color w:val="000000" w:themeColor="text1"/>
+        </w:rPr>
+        <w:t>A typical adult cat needs approximately 5 grams of protein per kilogram of body weight per day to stay healthy — based on recommendations from veterinary nutrition science, including the NRC (National Research Council).</w:t>
+      </w:r>
+    </w:p>
+    <w:p>
+      <w:pPr>
+        <w:rPr>
+          <w:b/>
+          <w:bCs/>
+          <w:color w:val="000000" w:themeColor="text1"/>
+        </w:rPr>
+      </w:pPr>
+      <w:r>
+        <w:rPr>
+          <w:b/>
+          <w:bCs/>
+          <w:color w:val="000000" w:themeColor="text1"/>
+        </w:rPr>
+        <w:lastRenderedPageBreak/>
+        <w:pict w14:anchorId="4154AB07">
+          <v:rect id="_x0000_i1043" style="width:0;height:1.5pt" o:hralign="center" o:hrstd="t" o:hr="t" fillcolor="#a0a0a0" stroked="f"/>
+        </w:pict>
+      </w:r>
+    </w:p>
+    <w:p>
+      <w:pPr>
+        <w:rPr>
+          <w:b/>
+          <w:bCs/>
+          <w:color w:val="000000" w:themeColor="text1"/>
+        </w:rPr>
+      </w:pPr>
+      <w:r>
+        <w:rPr>
+          <w:rFonts w:ascii="Segoe UI Emoji" w:hAnsi="Segoe UI Emoji" w:cs="Segoe UI Emoji"/>
+          <w:b/>
+          <w:bCs/>
+          <w:color w:val="000000" w:themeColor="text1"/>
+        </w:rPr>
+        <w:t>🔹</w:t>
+      </w:r>
+      <w:r>
+        <w:rPr>
+          <w:b/>
+          <w:bCs/>
+          <w:color w:val="000000" w:themeColor="text1"/>
+        </w:rPr>
+        <w:t xml:space="preserve"> Example:</w:t>
+      </w:r>
+    </w:p>
+    <w:p>
+      <w:pPr>
+        <w:rPr>
+          <w:b/>
+          <w:bCs/>
+          <w:color w:val="000000" w:themeColor="text1"/>
+        </w:rPr>
+      </w:pPr>
+      <w:r>
+        <w:rPr>
+          <w:b/>
+          <w:bCs/>
+          <w:color w:val="000000" w:themeColor="text1"/>
+        </w:rPr>
+        <w:t xml:space="preserve">If your cat weighs 4 kg (about 9 </w:t>
+      </w:r>
+      <w:proofErr w:type="spellStart"/>
+      <w:r>
+        <w:rPr>
+          <w:b/>
+          <w:bCs/>
+          <w:color w:val="000000" w:themeColor="text1"/>
+        </w:rPr>
+        <w:t>lbs</w:t>
+      </w:r>
+      <w:proofErr w:type="spellEnd"/>
+      <w:r>
+        <w:rPr>
+          <w:b/>
+          <w:bCs/>
+          <w:color w:val="000000" w:themeColor="text1"/>
+        </w:rPr>
+        <w:t>):</w:t>
+      </w:r>
+    </w:p>
+    <w:p>
+      <w:pPr>
+        <w:rPr>
+          <w:b/>
+          <w:bCs/>
+          <w:color w:val="000000" w:themeColor="text1"/>
+        </w:rPr>
+      </w:pPr>
+      <w:r>
+        <w:rPr>
+          <w:b/>
+          <w:bCs/>
+          <w:color w:val="000000" w:themeColor="text1"/>
+        </w:rPr>
+        <w:t>4 kg × 5 g = 20 grams of protein per day</w:t>
+      </w:r>
+    </w:p>
+    <w:p>
+      <w:pPr>
+        <w:rPr>
+          <w:b/>
+          <w:bCs/>
+          <w:color w:val="000000" w:themeColor="text1"/>
+        </w:rPr>
+      </w:pPr>
+      <w:r>
+        <w:rPr>
+          <w:b/>
+          <w:bCs/>
+          <w:color w:val="000000" w:themeColor="text1"/>
+        </w:rPr>
+        <w:t>This is assuming:</w:t>
       </w:r>
     </w:p>
     <w:p>
       <w:pPr>
         <w:numPr>
           <w:ilvl w:val="0"/>
-          <w:numId w:val="2"/>
+          <w:numId w:val="3"/>
         </w:numPr>
-      </w:pPr>
-      <w:r>
-        <w:t>Then, ask it to "explain how GenAI app is developed and trained" and read the output.</w:t>
+        <w:rPr>
+          <w:b/>
+          <w:bCs/>
+          <w:color w:val="000000" w:themeColor="text1"/>
+        </w:rPr>
+      </w:pPr>
+      <w:r>
+        <w:rPr>
+          <w:b/>
+          <w:bCs/>
+          <w:color w:val="000000" w:themeColor="text1"/>
+        </w:rPr>
+        <w:t>The cat is healthy and not overweight</w:t>
       </w:r>
     </w:p>
     <w:p>
       <w:pPr>
         <w:numPr>
           <w:ilvl w:val="0"/>
-          <w:numId w:val="2"/>
+          <w:numId w:val="3"/>
         </w:numPr>
-      </w:pPr>
-      <w:r>
-        <w:t xml:space="preserve">Then, </w:t>
+        <w:rPr>
+          <w:b/>
+          <w:bCs/>
+          <w:color w:val="000000" w:themeColor="text1"/>
+        </w:rPr>
+      </w:pPr>
+      <w:r>
+        <w:rPr>
+          <w:b/>
+          <w:bCs/>
+          <w:color w:val="000000" w:themeColor="text1"/>
+        </w:rPr>
+        <w:t>The diet is high-quality and digestible</w:t>
+      </w:r>
+    </w:p>
+    <w:p>
+      <w:pPr>
+        <w:rPr>
+          <w:b/>
+          <w:bCs/>
+          <w:color w:val="000000" w:themeColor="text1"/>
+        </w:rPr>
+      </w:pPr>
+      <w:r>
+        <w:rPr>
+          <w:b/>
+          <w:bCs/>
+          <w:color w:val="000000" w:themeColor="text1"/>
+        </w:rPr>
+        <w:pict w14:anchorId="6832115F">
+          <v:rect id="_x0000_i1044" style="width:0;height:1.5pt" o:hralign="center" o:hrstd="t" o:hr="t" fillcolor="#a0a0a0" stroked="f"/>
+        </w:pict>
+      </w:r>
+    </w:p>
+    <w:p>
+      <w:pPr>
+        <w:rPr>
+          <w:b/>
+          <w:bCs/>
+          <w:color w:val="000000" w:themeColor="text1"/>
+        </w:rPr>
+      </w:pPr>
+      <w:r>
+        <w:rPr>
+          <w:rFonts w:ascii="Segoe UI Emoji" w:hAnsi="Segoe UI Emoji" w:cs="Segoe UI Emoji"/>
+          <w:b/>
+          <w:bCs/>
+          <w:color w:val="000000" w:themeColor="text1"/>
+        </w:rPr>
+        <w:t>🔸</w:t>
+      </w:r>
+      <w:r>
+        <w:rPr>
+          <w:b/>
+          <w:bCs/>
+          <w:color w:val="000000" w:themeColor="text1"/>
+        </w:rPr>
+        <w:t xml:space="preserve"> Important Notes:</w:t>
+      </w:r>
+    </w:p>
+    <w:p>
+      <w:pPr>
+        <w:numPr>
+          <w:ilvl w:val="0"/>
+          <w:numId w:val="4"/>
+        </w:numPr>
+        <w:rPr>
+          <w:b/>
+          <w:bCs/>
+          <w:color w:val="000000" w:themeColor="text1"/>
+        </w:rPr>
+      </w:pPr>
+      <w:r>
+        <w:rPr>
+          <w:b/>
+          <w:bCs/>
+          <w:color w:val="000000" w:themeColor="text1"/>
+        </w:rPr>
+        <w:t>Kittens, pregnant, or nursing cats need significantly more — up to 12–13 g/kg/day</w:t>
+      </w:r>
+    </w:p>
+    <w:p>
+      <w:pPr>
+        <w:numPr>
+          <w:ilvl w:val="0"/>
+          <w:numId w:val="4"/>
+        </w:numPr>
+        <w:rPr>
+          <w:b/>
+          <w:bCs/>
+          <w:color w:val="000000" w:themeColor="text1"/>
+        </w:rPr>
+      </w:pPr>
+      <w:r>
+        <w:rPr>
+          <w:b/>
+          <w:bCs/>
+          <w:color w:val="000000" w:themeColor="text1"/>
+        </w:rPr>
+        <w:t>Senior cats or cats with kidney disease might need modified protein intake (either higher quality or reduced amount — depending on the vet’s recommendation)</w:t>
+      </w:r>
+    </w:p>
+    <w:p>
+      <w:pPr>
+        <w:rPr>
+          <w:b/>
+          <w:bCs/>
+          <w:color w:val="000000" w:themeColor="text1"/>
+        </w:rPr>
+      </w:pPr>
+      <w:r>
+        <w:rPr>
+          <w:b/>
+          <w:bCs/>
+          <w:color w:val="000000" w:themeColor="text1"/>
+        </w:rPr>
+        <w:pict w14:anchorId="63D1490B">
+          <v:rect id="_x0000_i1045" style="width:0;height:1.5pt" o:hralign="center" o:hrstd="t" o:hr="t" fillcolor="#a0a0a0" stroked="f"/>
+        </w:pict>
+      </w:r>
+    </w:p>
+    <w:p>
+      <w:pPr>
+        <w:rPr>
+          <w:b/>
+          <w:bCs/>
+          <w:color w:val="000000" w:themeColor="text1"/>
+        </w:rPr>
+      </w:pPr>
+      <w:r>
+        <w:rPr>
+          <w:rFonts w:ascii="Segoe UI Emoji" w:hAnsi="Segoe UI Emoji" w:cs="Segoe UI Emoji"/>
+          <w:b/>
+          <w:bCs/>
+          <w:color w:val="000000" w:themeColor="text1"/>
+        </w:rPr>
+        <w:t>🔍</w:t>
+      </w:r>
+      <w:r>
+        <w:rPr>
+          <w:b/>
+          <w:bCs/>
+          <w:color w:val="000000" w:themeColor="text1"/>
+        </w:rPr>
+        <w:t xml:space="preserve"> Source-Backed Info:</w:t>
+      </w:r>
+    </w:p>
+    <w:p>
+      <w:pPr>
+        <w:numPr>
+          <w:ilvl w:val="0"/>
+          <w:numId w:val="5"/>
+        </w:numPr>
+        <w:rPr>
+          <w:b/>
+          <w:bCs/>
+          <w:color w:val="000000" w:themeColor="text1"/>
+        </w:rPr>
+      </w:pPr>
+      <w:r>
+        <w:rPr>
+          <w:b/>
+          <w:bCs/>
+          <w:color w:val="000000" w:themeColor="text1"/>
+        </w:rPr>
+        <w:t xml:space="preserve">National Research Council (2006): </w:t>
+      </w:r>
+      <w:r>
+        <w:rPr>
+          <w:b/>
+          <w:bCs/>
+          <w:i/>
+          <w:iCs/>
+          <w:color w:val="000000" w:themeColor="text1"/>
+        </w:rPr>
+        <w:t>Nutrient Requirements of Dogs and Cats</w:t>
+      </w:r>
+    </w:p>
+    <w:p>
+      <w:pPr>
+        <w:numPr>
+          <w:ilvl w:val="0"/>
+          <w:numId w:val="5"/>
+        </w:numPr>
+        <w:rPr>
+          <w:b/>
+          <w:bCs/>
+          <w:color w:val="000000" w:themeColor="text1"/>
+        </w:rPr>
+      </w:pPr>
+      <w:r>
+        <w:rPr>
+          <w:b/>
+          <w:bCs/>
+          <w:color w:val="000000" w:themeColor="text1"/>
+        </w:rPr>
+        <w:t>Veterinary nutritionists generally recommend adult cats get at least 2.5g of protein per pound of body weight per day (≈5.5g/kg)</w:t>
+      </w:r>
+    </w:p>
+    <w:p>
+      <w:pPr>
+        <w:rPr>
+          <w:b/>
+          <w:bCs/>
+          <w:color w:val="000000" w:themeColor="text1"/>
+        </w:rPr>
+      </w:pPr>
+      <w:r>
+        <w:rPr>
+          <w:b/>
+          <w:bCs/>
+          <w:color w:val="000000" w:themeColor="text1"/>
+        </w:rPr>
+        <w:t>Let me know if you want help writing this into an assignment format with verification steps.</w:t>
+      </w:r>
+    </w:p>
+    <w:p>
+      <w:pPr>
+        <w:rPr>
+          <w:b/>
+          <w:bCs/>
+          <w:color w:val="0F9ED5" w:themeColor="accent4"/>
+          <w:sz w:val="28"/>
+          <w:szCs w:val="28"/>
+        </w:rPr>
+      </w:pPr>
+    </w:p>
+    <w:p>
+      <w:pPr>
+        <w:rPr>
+          <w:b/>
+          <w:bCs/>
+        </w:rPr>
+      </w:pPr>
+      <w:r>
+        <w:rPr>
+          <w:b/>
+          <w:bCs/>
+          <w:color w:val="0F9ED5" w:themeColor="accent4"/>
+          <w:sz w:val="28"/>
+          <w:szCs w:val="28"/>
+        </w:rPr>
+        <w:t>H</w:t>
+      </w:r>
+      <w:r>
+        <w:rPr>
+          <w:b/>
+          <w:bCs/>
+          <w:color w:val="0F9ED5" w:themeColor="accent4"/>
+          <w:sz w:val="28"/>
+          <w:szCs w:val="28"/>
+        </w:rPr>
+        <w:t>ow far does the average bird fly a day</w:t>
+      </w:r>
+      <w:r>
+        <w:rPr>
+          <w:b/>
+          <w:bCs/>
+          <w:color w:val="0F9ED5" w:themeColor="accent4"/>
+          <w:sz w:val="28"/>
+          <w:szCs w:val="28"/>
+        </w:rPr>
+        <w:t>?</w:t>
+      </w:r>
+      <w:r>
+        <w:rPr>
+          <w:b/>
+          <w:bCs/>
+          <w:color w:val="0F9ED5" w:themeColor="accent4"/>
+          <w:sz w:val="28"/>
+          <w:szCs w:val="28"/>
+        </w:rPr>
+        <w:br/>
+      </w:r>
+      <w:r>
+        <w:rPr>
+          <w:b/>
+          <w:bCs/>
+        </w:rPr>
+        <w:t>The distance a bird flies per day varies wildly depending on the species, purpose (migration vs. daily activity), and environmental conditions.</w:t>
+      </w:r>
+    </w:p>
+    <w:p>
+      <w:pPr>
+        <w:rPr>
+          <w:b/>
+          <w:bCs/>
+        </w:rPr>
+      </w:pPr>
+      <w:r>
+        <w:rPr>
+          <w:b/>
+          <w:bCs/>
+        </w:rPr>
+        <w:t>Here’s a breakdown:</w:t>
+      </w:r>
+    </w:p>
+    <w:p>
+      <w:pPr>
+        <w:rPr>
+          <w:b/>
+          <w:bCs/>
+        </w:rPr>
+      </w:pPr>
+      <w:r>
+        <w:rPr>
+          <w:b/>
+          <w:bCs/>
+        </w:rPr>
+        <w:pict w14:anchorId="168A823A">
+          <v:rect id="_x0000_i1088" style="width:0;height:1.5pt" o:hralign="center" o:hrstd="t" o:hr="t" fillcolor="#a0a0a0" stroked="f"/>
+        </w:pict>
+      </w:r>
+    </w:p>
+    <w:p>
+      <w:pPr>
+        <w:rPr>
+          <w:b/>
+          <w:bCs/>
+        </w:rPr>
+      </w:pPr>
+      <w:r>
+        <w:rPr>
+          <w:rFonts w:ascii="Segoe UI Emoji" w:hAnsi="Segoe UI Emoji" w:cs="Segoe UI Emoji"/>
+          <w:b/>
+          <w:bCs/>
+        </w:rPr>
+        <w:t>🐦</w:t>
+      </w:r>
+      <w:r>
+        <w:rPr>
+          <w:b/>
+          <w:bCs/>
+        </w:rPr>
+        <w:t xml:space="preserve"> 1. Everyday Local Travel (Non-Migratory Birds)</w:t>
+      </w:r>
+    </w:p>
+    <w:p>
+      <w:pPr>
+        <w:numPr>
+          <w:ilvl w:val="0"/>
+          <w:numId w:val="6"/>
+        </w:numPr>
+        <w:rPr>
+          <w:b/>
+          <w:bCs/>
+        </w:rPr>
+      </w:pPr>
+      <w:r>
+        <w:rPr>
+          <w:b/>
+          <w:bCs/>
+        </w:rPr>
+        <w:lastRenderedPageBreak/>
+        <w:t>Most small birds (like sparrows or robins) fly a few kilometers per day for food, nesting, or territory.</w:t>
+      </w:r>
+    </w:p>
+    <w:p>
+      <w:pPr>
+        <w:numPr>
+          <w:ilvl w:val="0"/>
+          <w:numId w:val="6"/>
+        </w:numPr>
+        <w:rPr>
+          <w:b/>
+          <w:bCs/>
+        </w:rPr>
+      </w:pPr>
+      <w:r>
+        <w:rPr>
+          <w:b/>
+          <w:bCs/>
+        </w:rPr>
+        <w:t>Roughly 2–10 km (1–6 miles) is typical.</w:t>
+      </w:r>
+    </w:p>
+    <w:p>
+      <w:pPr>
+        <w:rPr>
+          <w:b/>
+          <w:bCs/>
+        </w:rPr>
+      </w:pPr>
+      <w:r>
+        <w:rPr>
+          <w:b/>
+          <w:bCs/>
+        </w:rPr>
+        <w:pict w14:anchorId="5AB2B88B">
+          <v:rect id="_x0000_i1089" style="width:0;height:1.5pt" o:hralign="center" o:hrstd="t" o:hr="t" fillcolor="#a0a0a0" stroked="f"/>
+        </w:pict>
+      </w:r>
+    </w:p>
+    <w:p>
+      <w:pPr>
+        <w:rPr>
+          <w:b/>
+          <w:bCs/>
+        </w:rPr>
+      </w:pPr>
+      <w:r>
+        <w:rPr>
+          <w:rFonts w:ascii="Segoe UI Emoji" w:hAnsi="Segoe UI Emoji" w:cs="Segoe UI Emoji"/>
+          <w:b/>
+          <w:bCs/>
+        </w:rPr>
+        <w:t>🕊️</w:t>
+      </w:r>
+      <w:r>
+        <w:rPr>
+          <w:b/>
+          <w:bCs/>
+        </w:rPr>
+        <w:t xml:space="preserve"> 2. Pigeons and Doves</w:t>
+      </w:r>
+    </w:p>
+    <w:p>
+      <w:pPr>
+        <w:numPr>
+          <w:ilvl w:val="0"/>
+          <w:numId w:val="7"/>
+        </w:numPr>
+        <w:rPr>
+          <w:b/>
+          <w:bCs/>
+        </w:rPr>
+      </w:pPr>
+      <w:r>
+        <w:rPr>
+          <w:b/>
+          <w:bCs/>
+        </w:rPr>
+        <w:t>Trained homing pigeons can fly up to 100 km (60+ miles) in a day easily.</w:t>
+      </w:r>
+    </w:p>
+    <w:p>
+      <w:pPr>
+        <w:rPr>
+          <w:b/>
+          <w:bCs/>
+        </w:rPr>
+      </w:pPr>
+      <w:r>
+        <w:rPr>
+          <w:b/>
+          <w:bCs/>
+        </w:rPr>
+        <w:pict w14:anchorId="155EA5A8">
+          <v:rect id="_x0000_i1090" style="width:0;height:1.5pt" o:hralign="center" o:hrstd="t" o:hr="t" fillcolor="#a0a0a0" stroked="f"/>
+        </w:pict>
+      </w:r>
+    </w:p>
+    <w:p>
+      <w:pPr>
+        <w:rPr>
+          <w:b/>
+          <w:bCs/>
+        </w:rPr>
+      </w:pPr>
+      <w:r>
+        <w:rPr>
+          <w:rFonts w:ascii="Segoe UI Emoji" w:hAnsi="Segoe UI Emoji" w:cs="Segoe UI Emoji"/>
+          <w:b/>
+          <w:bCs/>
+        </w:rPr>
+        <w:t>🧭</w:t>
+      </w:r>
+      <w:r>
+        <w:rPr>
+          <w:b/>
+          <w:bCs/>
+        </w:rPr>
+        <w:t xml:space="preserve"> 3. Migratory Birds</w:t>
+      </w:r>
+    </w:p>
+    <w:p>
+      <w:pPr>
+        <w:rPr>
+          <w:b/>
+          <w:bCs/>
+        </w:rPr>
+      </w:pPr>
+      <w:r>
+        <w:rPr>
+          <w:b/>
+          <w:bCs/>
+        </w:rPr>
+        <w:t>When birds migrate, they cover serious distances:</w:t>
+      </w:r>
+    </w:p>
+    <w:p>
+      <w:pPr>
+        <w:numPr>
+          <w:ilvl w:val="0"/>
+          <w:numId w:val="8"/>
+        </w:numPr>
+        <w:rPr>
+          <w:b/>
+          <w:bCs/>
+        </w:rPr>
+      </w:pPr>
+      <w:r>
+        <w:rPr>
+          <w:b/>
+          <w:bCs/>
+        </w:rPr>
+        <w:t>Songbirds: 100–300 km/day (60–180 miles)</w:t>
+      </w:r>
+    </w:p>
+    <w:p>
+      <w:pPr>
+        <w:numPr>
+          <w:ilvl w:val="0"/>
+          <w:numId w:val="8"/>
+        </w:numPr>
+        <w:rPr>
+          <w:b/>
+          <w:bCs/>
+        </w:rPr>
+      </w:pPr>
+      <w:r>
+        <w:rPr>
+          <w:b/>
+          <w:bCs/>
+        </w:rPr>
+        <w:t>Geese, ducks, cranes: Up to 1,000 km/day (600+ miles) with favorable winds</w:t>
+      </w:r>
+    </w:p>
+    <w:p>
+      <w:pPr>
+        <w:numPr>
+          <w:ilvl w:val="0"/>
+          <w:numId w:val="8"/>
+        </w:numPr>
+        <w:rPr>
+          <w:b/>
+          <w:bCs/>
+        </w:rPr>
+      </w:pPr>
+      <w:r>
+        <w:rPr>
+          <w:b/>
+          <w:bCs/>
+        </w:rPr>
+        <w:t>Bar-tailed Godwit (holds the record):</w:t>
+      </w:r>
+    </w:p>
+    <w:p>
+      <w:pPr>
+        <w:numPr>
+          <w:ilvl w:val="1"/>
+          <w:numId w:val="8"/>
+        </w:numPr>
+        <w:rPr>
+          <w:b/>
+          <w:bCs/>
+        </w:rPr>
+      </w:pPr>
+      <w:r>
+        <w:rPr>
+          <w:b/>
+          <w:bCs/>
+        </w:rPr>
+        <w:t>Can fly 11,000 km (6,800 miles) non-stop over 8–10 days — that's over 1,000 km/day.</w:t>
+      </w:r>
+    </w:p>
+    <w:p>
+      <w:pPr>
+        <w:rPr>
+          <w:b/>
+          <w:bCs/>
+        </w:rPr>
+      </w:pPr>
+      <w:r>
+        <w:rPr>
+          <w:b/>
+          <w:bCs/>
+        </w:rPr>
+        <w:pict w14:anchorId="6B05ECDA">
+          <v:rect id="_x0000_i1091" style="width:0;height:1.5pt" o:hralign="center" o:hrstd="t" o:hr="t" fillcolor="#a0a0a0" stroked="f"/>
+        </w:pict>
+      </w:r>
+    </w:p>
+    <w:p>
+      <w:pPr>
+        <w:rPr>
+          <w:b/>
+          <w:bCs/>
+        </w:rPr>
+      </w:pPr>
+      <w:r>
+        <w:rPr>
+          <w:rFonts w:ascii="Segoe UI Emoji" w:hAnsi="Segoe UI Emoji" w:cs="Segoe UI Emoji"/>
+          <w:b/>
+          <w:bCs/>
+        </w:rPr>
+        <w:t>✅</w:t>
+      </w:r>
+      <w:r>
+        <w:rPr>
+          <w:b/>
+          <w:bCs/>
+        </w:rPr>
+        <w:t xml:space="preserve"> Summary Answer:</w:t>
+      </w:r>
+    </w:p>
+    <w:p>
+      <w:pPr>
+        <w:rPr>
+          <w:b/>
+          <w:bCs/>
+        </w:rPr>
+      </w:pPr>
+      <w:r>
+        <w:rPr>
+          <w:b/>
+          <w:bCs/>
+        </w:rPr>
+        <w:t xml:space="preserve">On average, a bird may fly a few kilometers per day in normal activity, but during migration, some birds can travel hundreds </w:t>
       </w:r>
       <w:proofErr w:type="gramStart"/>
       <w:r>
-        <w:t>ask it</w:t>
+        <w:rPr>
+          <w:b/>
+          <w:bCs/>
+        </w:rPr>
+        <w:t>to</w:t>
       </w:r>
       <w:proofErr w:type="gramEnd"/>
       <w:r>
-        <w:t xml:space="preserve"> "Does GenAI understand its output?" and read the output.</w:t>
-      </w:r>
+        <w:rPr>
+          <w:b/>
+          <w:bCs/>
+        </w:rPr>
+        <w:t xml:space="preserve"> over 1,000 km per day, depending on species and conditions.</w:t>
+      </w:r>
+    </w:p>
+    <w:p>
+      <w:pPr>
+        <w:rPr>
+          <w:b/>
+          <w:bCs/>
+        </w:rPr>
+      </w:pPr>
+      <w:r>
+        <w:rPr>
+          <w:b/>
+          <w:bCs/>
+        </w:rPr>
+        <w:pict w14:anchorId="5D5C6AB1">
+          <v:rect id="_x0000_i1092" style="width:0;height:1.5pt" o:hralign="center" o:hrstd="t" o:hr="t" fillcolor="#a0a0a0" stroked="f"/>
+        </w:pict>
+      </w:r>
+    </w:p>
+    <w:p>
+      <w:pPr>
+        <w:rPr>
+          <w:b/>
+          <w:bCs/>
+        </w:rPr>
+      </w:pPr>
+      <w:r>
+        <w:rPr>
+          <w:b/>
+          <w:bCs/>
+        </w:rPr>
+        <w:t>Want to verify a specific number or bird species?</w:t>
+      </w:r>
+    </w:p>
+    <w:p>
+      <w:pPr>
+        <w:rPr>
+          <w:b/>
+          <w:bCs/>
+        </w:rPr>
+      </w:pPr>
+    </w:p>
+    <w:p>
+      <w:pPr>
+        <w:rPr>
+          <w:b/>
+          <w:bCs/>
+        </w:rPr>
+      </w:pPr>
+    </w:p>
+    <w:p>
+      <w:pPr>
+        <w:rPr>
+          <w:b/>
+          <w:bCs/>
+        </w:rPr>
+      </w:pPr>
+    </w:p>
+    <w:p>
+      <w:pPr>
+        <w:rPr>
+          <w:b/>
+          <w:bCs/>
+        </w:rPr>
+      </w:pPr>
+    </w:p>
+    <w:p>
+      <w:pPr>
+        <w:rPr>
+          <w:b/>
+          <w:bCs/>
+        </w:rPr>
+      </w:pPr>
+    </w:p>
+    <w:p>
+      <w:pPr>
+        <w:rPr>
+          <w:b/>
+          <w:bCs/>
+        </w:rPr>
+      </w:pPr>
+    </w:p>
+    <w:p>
+      <w:pPr>
+        <w:rPr>
+          <w:b/>
+          <w:bCs/>
+          <w:sz w:val="28"/>
+          <w:szCs w:val="28"/>
+        </w:rPr>
+      </w:pPr>
+      <w:r>
+        <w:rPr>
+          <w:b/>
+          <w:bCs/>
+          <w:sz w:val="28"/>
+          <w:szCs w:val="28"/>
+        </w:rPr>
+        <w:lastRenderedPageBreak/>
+        <w:t>Part 3</w:t>
+      </w:r>
+    </w:p>
+    <w:p>
+      <w:r>
+        <w:t xml:space="preserve">I used </w:t>
+      </w:r>
+      <w:r>
+        <w:t xml:space="preserve">Claude and Google to verify my findings. </w:t>
+      </w:r>
+    </w:p>
+    <w:p>
+      <w:pPr>
+        <w:rPr>
+          <w:b/>
+          <w:bCs/>
+          <w:color w:val="0F9ED5" w:themeColor="accent4"/>
+          <w:sz w:val="28"/>
+          <w:szCs w:val="28"/>
+        </w:rPr>
+      </w:pPr>
+      <w:r>
+        <w:rPr>
+          <w:b/>
+          <w:bCs/>
+          <w:color w:val="0F9ED5" w:themeColor="accent4"/>
+          <w:sz w:val="28"/>
+          <w:szCs w:val="28"/>
+        </w:rPr>
+        <w:t>On Claude for “How much protein does a cat need in a day?”</w:t>
+      </w:r>
+      <w:r>
+        <w:rPr>
+          <w:b/>
+          <w:bCs/>
+          <w:color w:val="0F9ED5" w:themeColor="accent4"/>
+          <w:sz w:val="28"/>
+          <w:szCs w:val="28"/>
+        </w:rPr>
+        <w:t>:</w:t>
+      </w:r>
+    </w:p>
+    <w:p>
+      <w:r>
+        <w:t>Cats need approximately 2-3 grams of protein per kilogram of body weight per day, or about 1-1.4 grams per pound. For an average 10-pound (4.5 kg) cat, this translates to roughly 10-14 grams of protein daily.</w:t>
+      </w:r>
+    </w:p>
+    <w:p>
+      <w:r>
+        <w:t>However, the actual amount depends on several factors:</w:t>
+      </w:r>
+    </w:p>
+    <w:p>
+      <w:proofErr w:type="gramStart"/>
+      <w:r>
+        <w:rPr>
+          <w:b/>
+          <w:bCs/>
+        </w:rPr>
+        <w:t>Life stage</w:t>
+      </w:r>
+      <w:proofErr w:type="gramEnd"/>
+      <w:r>
+        <w:rPr>
+          <w:b/>
+          <w:bCs/>
+        </w:rPr>
+        <w:t xml:space="preserve"> matters most:</w:t>
+      </w:r>
+    </w:p>
+    <w:p>
+      <w:pPr>
+        <w:numPr>
+          <w:ilvl w:val="0"/>
+          <w:numId w:val="9"/>
+        </w:numPr>
+      </w:pPr>
+      <w:r>
+        <w:t>Kittens need significantly more protein (up to 35-50% of their diet) for growth</w:t>
+      </w:r>
+    </w:p>
+    <w:p>
+      <w:pPr>
+        <w:numPr>
+          <w:ilvl w:val="0"/>
+          <w:numId w:val="9"/>
+        </w:numPr>
+      </w:pPr>
+      <w:r>
+        <w:t>Adult cats typically need about 26-30% of their diet as protein</w:t>
+      </w:r>
+    </w:p>
+    <w:p>
+      <w:pPr>
+        <w:numPr>
+          <w:ilvl w:val="0"/>
+          <w:numId w:val="9"/>
+        </w:numPr>
+      </w:pPr>
+      <w:r>
+        <w:t>Senior cats may need slightly more to maintain muscle mass</w:t>
+      </w:r>
+    </w:p>
+    <w:p>
+      <w:r>
+        <w:rPr>
+          <w:b/>
+          <w:bCs/>
+        </w:rPr>
+        <w:t>Activity level and health:</w:t>
+      </w:r>
+    </w:p>
+    <w:p>
+      <w:pPr>
+        <w:numPr>
+          <w:ilvl w:val="0"/>
+          <w:numId w:val="10"/>
+        </w:numPr>
+      </w:pPr>
+      <w:r>
+        <w:t xml:space="preserve">Indoor cats may need less </w:t>
+      </w:r>
+      <w:proofErr w:type="gramStart"/>
+      <w:r>
+        <w:t>than very active outdoor</w:t>
+      </w:r>
+      <w:proofErr w:type="gramEnd"/>
+      <w:r>
+        <w:t xml:space="preserve"> cats</w:t>
+      </w:r>
+    </w:p>
+    <w:p>
+      <w:pPr>
+        <w:numPr>
+          <w:ilvl w:val="0"/>
+          <w:numId w:val="10"/>
+        </w:numPr>
+      </w:pPr>
+      <w:r>
+        <w:t>Pregnant or nursing cats require much higher protein intake</w:t>
+      </w:r>
+    </w:p>
+    <w:p>
+      <w:pPr>
+        <w:numPr>
+          <w:ilvl w:val="0"/>
+          <w:numId w:val="10"/>
+        </w:numPr>
+      </w:pPr>
+      <w:r>
+        <w:t>Cats recovering from illness may need additional protein</w:t>
+      </w:r>
+    </w:p>
+    <w:p>
+      <w:r>
+        <w:rPr>
+          <w:b/>
+          <w:bCs/>
+        </w:rPr>
+        <w:t>Quality vs. quantity:</w:t>
+      </w:r>
+      <w:r>
+        <w:t xml:space="preserve"> Cats require complete proteins containing all essential amino acids, particularly taurine, which they cannot produce themselves. Animal-based proteins are ideal since cats are </w:t>
+      </w:r>
+      <w:proofErr w:type="gramStart"/>
+      <w:r>
+        <w:t>obligate</w:t>
+      </w:r>
+      <w:proofErr w:type="gramEnd"/>
+      <w:r>
+        <w:t xml:space="preserve"> carnivores.</w:t>
+      </w:r>
+    </w:p>
+    <w:p>
+      <w:r>
+        <w:t xml:space="preserve">Most high-quality commercial cat foods are formulated to meet these requirements when fed according to package directions. If you're feeding a typical adult cat, following the feeding guidelines on </w:t>
+      </w:r>
+      <w:proofErr w:type="gramStart"/>
+      <w:r>
+        <w:t>a quality</w:t>
+      </w:r>
+      <w:proofErr w:type="gramEnd"/>
+      <w:r>
+        <w:t xml:space="preserve"> cat food should provide adequate protein. Always consult your veterinarian if you have concerns about your cat's specific nutritional needs or if you're considering a homemade diet.</w:t>
+      </w:r>
+    </w:p>
+    <w:p>
+      <w:pPr>
+        <w:rPr>
+          <w:b/>
+          <w:bCs/>
+          <w:color w:val="0F9ED5" w:themeColor="accent4"/>
+          <w:sz w:val="28"/>
+          <w:szCs w:val="28"/>
+        </w:rPr>
+      </w:pPr>
+      <w:r>
+        <w:rPr>
+          <w:b/>
+          <w:bCs/>
+          <w:color w:val="0F9ED5" w:themeColor="accent4"/>
+          <w:sz w:val="28"/>
+          <w:szCs w:val="28"/>
+        </w:rPr>
+        <w:t xml:space="preserve">On google: </w:t>
+      </w:r>
+    </w:p>
+    <w:p>
+      <w:hyperlink r:id="rId5" w:tgtFrame="_blank" w:history="1">
+        <w:r>
+          <w:rPr>
+            <w:rStyle w:val="Hyperlink"/>
+            <w:b/>
+            <w:bCs/>
+          </w:rPr>
+          <w:t>The recommended daily protein intake for cats varies</w:t>
+        </w:r>
+        <w:r>
+          <w:rPr>
+            <w:rStyle w:val="Hyperlink"/>
+          </w:rPr>
+          <w:t>, but on average, a healthy adult cat requires about 2-4 grams of protein per kilogram of body weight per day. For a 10-pound cat, this would be roughly 9-18 grams of protein daily. Kittens and nursing/pregnant cats need more protein, while senior cats require a minimum of 30% crude protein. </w:t>
+        </w:r>
+      </w:hyperlink>
     </w:p>
     <w:p/>
     <w:p>
-      <w:r>
-        <w:t>GenAI functions based on huge amounts of data that is pulled from various sources like books, websites, images, etc. With this data it learns patterns and different relationships in the data so it can perform whatever it is being trained for. The architecture that makes up most Gen AI models is a Transformer. They essentially process data based on the importance of each layer</w:t>
-      </w:r>
-      <w:r>
-        <w:t xml:space="preserve">. </w:t>
-      </w:r>
-    </w:p>
+      <w:pPr>
+        <w:rPr>
+          <w:b/>
+          <w:bCs/>
+          <w:sz w:val="28"/>
+          <w:szCs w:val="28"/>
+        </w:rPr>
+      </w:pPr>
+      <w:r>
+        <w:rPr>
+          <w:b/>
+          <w:bCs/>
+          <w:sz w:val="28"/>
+          <w:szCs w:val="28"/>
+        </w:rPr>
+        <w:lastRenderedPageBreak/>
+        <w:t>Part 4</w:t>
+      </w:r>
+    </w:p>
+    <w:p>
+      <w:r>
+        <w:t>Based on the information I found cross</w:t>
+      </w:r>
+      <w:r>
+        <w:t>-</w:t>
+      </w:r>
+      <w:r>
+        <w:t>referencing the same question, “How much protein do cat need to eat per day</w:t>
+      </w:r>
+      <w:r>
+        <w:t xml:space="preserve">?”, I found that the answer on ChatGPT is actually the most accurate. I found numbers on google which claimed 2-4 grams of protein per kg of body weight, but these numbers were pulled from an untrusting source, On Claude it was similar to the googled response around 2-3. What I found is that the values on other </w:t>
+      </w:r>
+      <w:proofErr w:type="spellStart"/>
+      <w:r>
+        <w:t>claude</w:t>
+      </w:r>
+      <w:proofErr w:type="spellEnd"/>
+      <w:r>
+        <w:t xml:space="preserve"> and google were referencing the minimum amount needed for a cat to survive while the source ChatGPT responded with was a gold-standard source for veterinary nutrition which I’m assuming is more of a recommendation to keep your cat healthy. The information is definitely true, just maybe a bit outdated. The information was from </w:t>
+      </w:r>
+      <w:proofErr w:type="gramStart"/>
+      <w:r>
+        <w:t>2006</w:t>
+      </w:r>
+      <w:proofErr w:type="gramEnd"/>
+      <w:r>
+        <w:t xml:space="preserve"> but I can’t imagine it really changes a whole lot over time. I used the fact that ChatGPT interpreted the question in a more understandable way at least in terms of feeding your own cat and not just one surviving in the wild.</w:t>
+      </w:r>
+    </w:p>
+    <w:p>
+      <w:r>
+        <w:t xml:space="preserve">Based on my experience the strengths of ChatGPT </w:t>
+      </w:r>
+      <w:proofErr w:type="gramStart"/>
+      <w:r>
+        <w:t>includes</w:t>
+      </w:r>
+      <w:proofErr w:type="gramEnd"/>
+      <w:r>
+        <w:t xml:space="preserve"> a very detailed response with actual sources to refer to. I believe the features to use the </w:t>
+      </w:r>
+      <w:proofErr w:type="gramStart"/>
+      <w:r>
+        <w:t>clipboard</w:t>
+      </w:r>
+      <w:proofErr w:type="gramEnd"/>
+      <w:r>
+        <w:t xml:space="preserve"> and copy chats directly from </w:t>
+      </w:r>
+      <w:proofErr w:type="spellStart"/>
+      <w:r>
+        <w:t>gpt</w:t>
+      </w:r>
+      <w:proofErr w:type="spellEnd"/>
+      <w:r>
+        <w:t xml:space="preserve"> into programs </w:t>
+      </w:r>
+      <w:proofErr w:type="gramStart"/>
+      <w:r>
+        <w:t>is</w:t>
+      </w:r>
+      <w:proofErr w:type="gramEnd"/>
+      <w:r>
+        <w:t xml:space="preserve"> specifically helpful, especially for notes on research. Weaknesses are that it didn’t catch that there were multiple conceptions to the question at hand</w:t>
+      </w:r>
+      <w:r>
+        <w:t xml:space="preserve"> and it was quite confused when I said to double check. In order to minimize these weaknesses, I can be much more specific with keywords and what I want done. I think asking general questions can give you a wide range of results as it can be understood in a few different ways.</w:t>
+      </w:r>
+    </w:p>
+    <w:p>
+      <w:pPr>
+        <w:rPr>
+          <w:b/>
+          <w:bCs/>
+          <w:sz w:val="28"/>
+          <w:szCs w:val="28"/>
+        </w:rPr>
+      </w:pPr>
+    </w:p>
+    <w:p/>
     <w:p/>
     <w:p/>
     <w:sectPr>
@@ -61,6 +1355,602 @@
 <file path=word/numbering.xml><?xml version="1.0" encoding="utf-8"?>
 <w:numbering xmlns:wpc="http://schemas.microsoft.com/office/word/2010/wordprocessingCanvas" xmlns:cx="http://schemas.microsoft.com/office/drawing/2014/chartex" xmlns:cx1="http://schemas.microsoft.com/office/drawing/2015/9/8/chartex" xmlns:cx2="http://schemas.microsoft.com/office/drawing/2015/10/21/chartex" xmlns:cx3="http://schemas.microsoft.com/office/drawing/2016/5/9/chartex" xmlns:cx4="http://schemas.microsoft.com/office/drawing/2016/5/10/chartex" xmlns:cx5="http://schemas.microsoft.com/office/drawing/2016/5/11/chartex" xmlns:cx6="http://schemas.microsoft.com/office/drawing/2016/5/12/chartex" xmlns:cx7="http://schemas.microsoft.com/office/drawing/2016/5/13/chartex" xmlns:cx8="http://schemas.microsoft.com/office/drawing/2016/5/14/chartex" xmlns:mc="http://schemas.openxmlformats.org/markup-compatibility/2006" xmlns:aink="http://schemas.microsoft.com/office/drawing/2016/ink" xmlns:am3d="http://schemas.microsoft.com/office/drawing/2017/model3d" xmlns:o="urn:schemas-microsoft-com:office:office" xmlns:oel="http://schemas.microsoft.com/office/2019/extlst" xmlns:r="http://schemas.openxmlformats.org/officeDocument/2006/relationships" xmlns:m="http://schemas.openxmlformats.org/officeDocument/2006/math" xmlns:v="urn:schemas-microsoft-com:vml" xmlns:wp14="http://schemas.microsoft.com/office/word/2010/wordprocessingDrawing" xmlns:wp="http://schemas.openxmlformats.org/drawingml/2006/wordprocessingDrawing" xmlns:w10="urn:schemas-microsoft-com:office:word" xmlns:w="http://schemas.openxmlformats.org/wordprocessingml/2006/main" xmlns:w14="http://schemas.microsoft.com/office/word/2010/wordml" xmlns:w15="http://schemas.microsoft.com/office/word/2012/wordml" xmlns:w16cex="http://schemas.microsoft.com/office/word/2018/wordml/cex" xmlns:w16cid="http://schemas.microsoft.com/office/word/2016/wordml/cid" xmlns:w16="http://schemas.microsoft.com/office/word/2018/wordml" xmlns:w16du="http://schemas.microsoft.com/office/word/2023/wordml/word16du" xmlns:w16sdtdh="http://schemas.microsoft.com/office/word/2020/wordml/sdtdatahash" xmlns:w16sdtfl="http://schemas.microsoft.com/office/word/2024/wordml/sdtformatlock" xmlns:w16se="http://schemas.microsoft.com/office/word/2015/wordml/symex" xmlns:wpg="http://schemas.microsoft.com/office/word/2010/wordprocessingGroup" xmlns:wpi="http://schemas.microsoft.com/office/word/2010/wordprocessingInk" xmlns:wne="http://schemas.microsoft.com/office/word/2006/wordml" xmlns:wps="http://schemas.microsoft.com/office/word/2010/wordprocessingShape" mc:Ignorable="w14 w15 w16se w16cid w16 w16cex w16sdtdh w16sdtfl w16du wp14">
   <w:abstractNum w:abstractNumId="0" w15:restartNumberingAfterBreak="0">
+    <w:nsid w:val="0CBF364A"/>
+    <w:multiLevelType w:val="multilevel"/>
+    <w:tmpl w:val="D9F65E9E"/>
+    <w:lvl w:ilvl="0">
+      <w:start w:val="1"/>
+      <w:numFmt w:val="bullet"/>
+      <w:lvlText w:val=""/>
+      <w:lvlJc w:val="left"/>
+      <w:pPr>
+        <w:tabs>
+          <w:tab w:val="num" w:pos="720"/>
+        </w:tabs>
+        <w:ind w:left="720" w:hanging="360"/>
+      </w:pPr>
+      <w:rPr>
+        <w:rFonts w:ascii="Symbol" w:hAnsi="Symbol" w:hint="default"/>
+        <w:sz w:val="20"/>
+      </w:rPr>
+    </w:lvl>
+    <w:lvl w:ilvl="1" w:tentative="1">
+      <w:start w:val="1"/>
+      <w:numFmt w:val="bullet"/>
+      <w:lvlText w:val="o"/>
+      <w:lvlJc w:val="left"/>
+      <w:pPr>
+        <w:tabs>
+          <w:tab w:val="num" w:pos="1440"/>
+        </w:tabs>
+        <w:ind w:left="1440" w:hanging="360"/>
+      </w:pPr>
+      <w:rPr>
+        <w:rFonts w:ascii="Courier New" w:hAnsi="Courier New" w:hint="default"/>
+        <w:sz w:val="20"/>
+      </w:rPr>
+    </w:lvl>
+    <w:lvl w:ilvl="2" w:tentative="1">
+      <w:start w:val="1"/>
+      <w:numFmt w:val="bullet"/>
+      <w:lvlText w:val=""/>
+      <w:lvlJc w:val="left"/>
+      <w:pPr>
+        <w:tabs>
+          <w:tab w:val="num" w:pos="2160"/>
+        </w:tabs>
+        <w:ind w:left="2160" w:hanging="360"/>
+      </w:pPr>
+      <w:rPr>
+        <w:rFonts w:ascii="Wingdings" w:hAnsi="Wingdings" w:hint="default"/>
+        <w:sz w:val="20"/>
+      </w:rPr>
+    </w:lvl>
+    <w:lvl w:ilvl="3" w:tentative="1">
+      <w:start w:val="1"/>
+      <w:numFmt w:val="bullet"/>
+      <w:lvlText w:val=""/>
+      <w:lvlJc w:val="left"/>
+      <w:pPr>
+        <w:tabs>
+          <w:tab w:val="num" w:pos="2880"/>
+        </w:tabs>
+        <w:ind w:left="2880" w:hanging="360"/>
+      </w:pPr>
+      <w:rPr>
+        <w:rFonts w:ascii="Wingdings" w:hAnsi="Wingdings" w:hint="default"/>
+        <w:sz w:val="20"/>
+      </w:rPr>
+    </w:lvl>
+    <w:lvl w:ilvl="4" w:tentative="1">
+      <w:start w:val="1"/>
+      <w:numFmt w:val="bullet"/>
+      <w:lvlText w:val=""/>
+      <w:lvlJc w:val="left"/>
+      <w:pPr>
+        <w:tabs>
+          <w:tab w:val="num" w:pos="3600"/>
+        </w:tabs>
+        <w:ind w:left="3600" w:hanging="360"/>
+      </w:pPr>
+      <w:rPr>
+        <w:rFonts w:ascii="Wingdings" w:hAnsi="Wingdings" w:hint="default"/>
+        <w:sz w:val="20"/>
+      </w:rPr>
+    </w:lvl>
+    <w:lvl w:ilvl="5" w:tentative="1">
+      <w:start w:val="1"/>
+      <w:numFmt w:val="bullet"/>
+      <w:lvlText w:val=""/>
+      <w:lvlJc w:val="left"/>
+      <w:pPr>
+        <w:tabs>
+          <w:tab w:val="num" w:pos="4320"/>
+        </w:tabs>
+        <w:ind w:left="4320" w:hanging="360"/>
+      </w:pPr>
+      <w:rPr>
+        <w:rFonts w:ascii="Wingdings" w:hAnsi="Wingdings" w:hint="default"/>
+        <w:sz w:val="20"/>
+      </w:rPr>
+    </w:lvl>
+    <w:lvl w:ilvl="6" w:tentative="1">
+      <w:start w:val="1"/>
+      <w:numFmt w:val="bullet"/>
+      <w:lvlText w:val=""/>
+      <w:lvlJc w:val="left"/>
+      <w:pPr>
+        <w:tabs>
+          <w:tab w:val="num" w:pos="5040"/>
+        </w:tabs>
+        <w:ind w:left="5040" w:hanging="360"/>
+      </w:pPr>
+      <w:rPr>
+        <w:rFonts w:ascii="Wingdings" w:hAnsi="Wingdings" w:hint="default"/>
+        <w:sz w:val="20"/>
+      </w:rPr>
+    </w:lvl>
+    <w:lvl w:ilvl="7" w:tentative="1">
+      <w:start w:val="1"/>
+      <w:numFmt w:val="bullet"/>
+      <w:lvlText w:val=""/>
+      <w:lvlJc w:val="left"/>
+      <w:pPr>
+        <w:tabs>
+          <w:tab w:val="num" w:pos="5760"/>
+        </w:tabs>
+        <w:ind w:left="5760" w:hanging="360"/>
+      </w:pPr>
+      <w:rPr>
+        <w:rFonts w:ascii="Wingdings" w:hAnsi="Wingdings" w:hint="default"/>
+        <w:sz w:val="20"/>
+      </w:rPr>
+    </w:lvl>
+    <w:lvl w:ilvl="8" w:tentative="1">
+      <w:start w:val="1"/>
+      <w:numFmt w:val="bullet"/>
+      <w:lvlText w:val=""/>
+      <w:lvlJc w:val="left"/>
+      <w:pPr>
+        <w:tabs>
+          <w:tab w:val="num" w:pos="6480"/>
+        </w:tabs>
+        <w:ind w:left="6480" w:hanging="360"/>
+      </w:pPr>
+      <w:rPr>
+        <w:rFonts w:ascii="Wingdings" w:hAnsi="Wingdings" w:hint="default"/>
+        <w:sz w:val="20"/>
+      </w:rPr>
+    </w:lvl>
+  </w:abstractNum>
+  <w:abstractNum w:abstractNumId="1" w15:restartNumberingAfterBreak="0">
+    <w:nsid w:val="20EA69A4"/>
+    <w:multiLevelType w:val="multilevel"/>
+    <w:tmpl w:val="331E8906"/>
+    <w:lvl w:ilvl="0">
+      <w:start w:val="1"/>
+      <w:numFmt w:val="bullet"/>
+      <w:lvlText w:val=""/>
+      <w:lvlJc w:val="left"/>
+      <w:pPr>
+        <w:tabs>
+          <w:tab w:val="num" w:pos="720"/>
+        </w:tabs>
+        <w:ind w:left="720" w:hanging="360"/>
+      </w:pPr>
+      <w:rPr>
+        <w:rFonts w:ascii="Symbol" w:hAnsi="Symbol" w:hint="default"/>
+        <w:sz w:val="20"/>
+      </w:rPr>
+    </w:lvl>
+    <w:lvl w:ilvl="1" w:tentative="1">
+      <w:start w:val="1"/>
+      <w:numFmt w:val="bullet"/>
+      <w:lvlText w:val="o"/>
+      <w:lvlJc w:val="left"/>
+      <w:pPr>
+        <w:tabs>
+          <w:tab w:val="num" w:pos="1440"/>
+        </w:tabs>
+        <w:ind w:left="1440" w:hanging="360"/>
+      </w:pPr>
+      <w:rPr>
+        <w:rFonts w:ascii="Courier New" w:hAnsi="Courier New" w:hint="default"/>
+        <w:sz w:val="20"/>
+      </w:rPr>
+    </w:lvl>
+    <w:lvl w:ilvl="2" w:tentative="1">
+      <w:start w:val="1"/>
+      <w:numFmt w:val="bullet"/>
+      <w:lvlText w:val=""/>
+      <w:lvlJc w:val="left"/>
+      <w:pPr>
+        <w:tabs>
+          <w:tab w:val="num" w:pos="2160"/>
+        </w:tabs>
+        <w:ind w:left="2160" w:hanging="360"/>
+      </w:pPr>
+      <w:rPr>
+        <w:rFonts w:ascii="Wingdings" w:hAnsi="Wingdings" w:hint="default"/>
+        <w:sz w:val="20"/>
+      </w:rPr>
+    </w:lvl>
+    <w:lvl w:ilvl="3" w:tentative="1">
+      <w:start w:val="1"/>
+      <w:numFmt w:val="bullet"/>
+      <w:lvlText w:val=""/>
+      <w:lvlJc w:val="left"/>
+      <w:pPr>
+        <w:tabs>
+          <w:tab w:val="num" w:pos="2880"/>
+        </w:tabs>
+        <w:ind w:left="2880" w:hanging="360"/>
+      </w:pPr>
+      <w:rPr>
+        <w:rFonts w:ascii="Wingdings" w:hAnsi="Wingdings" w:hint="default"/>
+        <w:sz w:val="20"/>
+      </w:rPr>
+    </w:lvl>
+    <w:lvl w:ilvl="4" w:tentative="1">
+      <w:start w:val="1"/>
+      <w:numFmt w:val="bullet"/>
+      <w:lvlText w:val=""/>
+      <w:lvlJc w:val="left"/>
+      <w:pPr>
+        <w:tabs>
+          <w:tab w:val="num" w:pos="3600"/>
+        </w:tabs>
+        <w:ind w:left="3600" w:hanging="360"/>
+      </w:pPr>
+      <w:rPr>
+        <w:rFonts w:ascii="Wingdings" w:hAnsi="Wingdings" w:hint="default"/>
+        <w:sz w:val="20"/>
+      </w:rPr>
+    </w:lvl>
+    <w:lvl w:ilvl="5" w:tentative="1">
+      <w:start w:val="1"/>
+      <w:numFmt w:val="bullet"/>
+      <w:lvlText w:val=""/>
+      <w:lvlJc w:val="left"/>
+      <w:pPr>
+        <w:tabs>
+          <w:tab w:val="num" w:pos="4320"/>
+        </w:tabs>
+        <w:ind w:left="4320" w:hanging="360"/>
+      </w:pPr>
+      <w:rPr>
+        <w:rFonts w:ascii="Wingdings" w:hAnsi="Wingdings" w:hint="default"/>
+        <w:sz w:val="20"/>
+      </w:rPr>
+    </w:lvl>
+    <w:lvl w:ilvl="6" w:tentative="1">
+      <w:start w:val="1"/>
+      <w:numFmt w:val="bullet"/>
+      <w:lvlText w:val=""/>
+      <w:lvlJc w:val="left"/>
+      <w:pPr>
+        <w:tabs>
+          <w:tab w:val="num" w:pos="5040"/>
+        </w:tabs>
+        <w:ind w:left="5040" w:hanging="360"/>
+      </w:pPr>
+      <w:rPr>
+        <w:rFonts w:ascii="Wingdings" w:hAnsi="Wingdings" w:hint="default"/>
+        <w:sz w:val="20"/>
+      </w:rPr>
+    </w:lvl>
+    <w:lvl w:ilvl="7" w:tentative="1">
+      <w:start w:val="1"/>
+      <w:numFmt w:val="bullet"/>
+      <w:lvlText w:val=""/>
+      <w:lvlJc w:val="left"/>
+      <w:pPr>
+        <w:tabs>
+          <w:tab w:val="num" w:pos="5760"/>
+        </w:tabs>
+        <w:ind w:left="5760" w:hanging="360"/>
+      </w:pPr>
+      <w:rPr>
+        <w:rFonts w:ascii="Wingdings" w:hAnsi="Wingdings" w:hint="default"/>
+        <w:sz w:val="20"/>
+      </w:rPr>
+    </w:lvl>
+    <w:lvl w:ilvl="8" w:tentative="1">
+      <w:start w:val="1"/>
+      <w:numFmt w:val="bullet"/>
+      <w:lvlText w:val=""/>
+      <w:lvlJc w:val="left"/>
+      <w:pPr>
+        <w:tabs>
+          <w:tab w:val="num" w:pos="6480"/>
+        </w:tabs>
+        <w:ind w:left="6480" w:hanging="360"/>
+      </w:pPr>
+      <w:rPr>
+        <w:rFonts w:ascii="Wingdings" w:hAnsi="Wingdings" w:hint="default"/>
+        <w:sz w:val="20"/>
+      </w:rPr>
+    </w:lvl>
+  </w:abstractNum>
+  <w:abstractNum w:abstractNumId="2" w15:restartNumberingAfterBreak="0">
+    <w:nsid w:val="2A8C76E6"/>
+    <w:multiLevelType w:val="multilevel"/>
+    <w:tmpl w:val="30B4EC7E"/>
+    <w:lvl w:ilvl="0">
+      <w:start w:val="1"/>
+      <w:numFmt w:val="bullet"/>
+      <w:lvlText w:val=""/>
+      <w:lvlJc w:val="left"/>
+      <w:pPr>
+        <w:tabs>
+          <w:tab w:val="num" w:pos="720"/>
+        </w:tabs>
+        <w:ind w:left="720" w:hanging="360"/>
+      </w:pPr>
+      <w:rPr>
+        <w:rFonts w:ascii="Symbol" w:hAnsi="Symbol" w:hint="default"/>
+        <w:sz w:val="20"/>
+      </w:rPr>
+    </w:lvl>
+    <w:lvl w:ilvl="1" w:tentative="1">
+      <w:start w:val="1"/>
+      <w:numFmt w:val="bullet"/>
+      <w:lvlText w:val="o"/>
+      <w:lvlJc w:val="left"/>
+      <w:pPr>
+        <w:tabs>
+          <w:tab w:val="num" w:pos="1440"/>
+        </w:tabs>
+        <w:ind w:left="1440" w:hanging="360"/>
+      </w:pPr>
+      <w:rPr>
+        <w:rFonts w:ascii="Courier New" w:hAnsi="Courier New" w:hint="default"/>
+        <w:sz w:val="20"/>
+      </w:rPr>
+    </w:lvl>
+    <w:lvl w:ilvl="2" w:tentative="1">
+      <w:start w:val="1"/>
+      <w:numFmt w:val="bullet"/>
+      <w:lvlText w:val=""/>
+      <w:lvlJc w:val="left"/>
+      <w:pPr>
+        <w:tabs>
+          <w:tab w:val="num" w:pos="2160"/>
+        </w:tabs>
+        <w:ind w:left="2160" w:hanging="360"/>
+      </w:pPr>
+      <w:rPr>
+        <w:rFonts w:ascii="Wingdings" w:hAnsi="Wingdings" w:hint="default"/>
+        <w:sz w:val="20"/>
+      </w:rPr>
+    </w:lvl>
+    <w:lvl w:ilvl="3" w:tentative="1">
+      <w:start w:val="1"/>
+      <w:numFmt w:val="bullet"/>
+      <w:lvlText w:val=""/>
+      <w:lvlJc w:val="left"/>
+      <w:pPr>
+        <w:tabs>
+          <w:tab w:val="num" w:pos="2880"/>
+        </w:tabs>
+        <w:ind w:left="2880" w:hanging="360"/>
+      </w:pPr>
+      <w:rPr>
+        <w:rFonts w:ascii="Wingdings" w:hAnsi="Wingdings" w:hint="default"/>
+        <w:sz w:val="20"/>
+      </w:rPr>
+    </w:lvl>
+    <w:lvl w:ilvl="4" w:tentative="1">
+      <w:start w:val="1"/>
+      <w:numFmt w:val="bullet"/>
+      <w:lvlText w:val=""/>
+      <w:lvlJc w:val="left"/>
+      <w:pPr>
+        <w:tabs>
+          <w:tab w:val="num" w:pos="3600"/>
+        </w:tabs>
+        <w:ind w:left="3600" w:hanging="360"/>
+      </w:pPr>
+      <w:rPr>
+        <w:rFonts w:ascii="Wingdings" w:hAnsi="Wingdings" w:hint="default"/>
+        <w:sz w:val="20"/>
+      </w:rPr>
+    </w:lvl>
+    <w:lvl w:ilvl="5" w:tentative="1">
+      <w:start w:val="1"/>
+      <w:numFmt w:val="bullet"/>
+      <w:lvlText w:val=""/>
+      <w:lvlJc w:val="left"/>
+      <w:pPr>
+        <w:tabs>
+          <w:tab w:val="num" w:pos="4320"/>
+        </w:tabs>
+        <w:ind w:left="4320" w:hanging="360"/>
+      </w:pPr>
+      <w:rPr>
+        <w:rFonts w:ascii="Wingdings" w:hAnsi="Wingdings" w:hint="default"/>
+        <w:sz w:val="20"/>
+      </w:rPr>
+    </w:lvl>
+    <w:lvl w:ilvl="6" w:tentative="1">
+      <w:start w:val="1"/>
+      <w:numFmt w:val="bullet"/>
+      <w:lvlText w:val=""/>
+      <w:lvlJc w:val="left"/>
+      <w:pPr>
+        <w:tabs>
+          <w:tab w:val="num" w:pos="5040"/>
+        </w:tabs>
+        <w:ind w:left="5040" w:hanging="360"/>
+      </w:pPr>
+      <w:rPr>
+        <w:rFonts w:ascii="Wingdings" w:hAnsi="Wingdings" w:hint="default"/>
+        <w:sz w:val="20"/>
+      </w:rPr>
+    </w:lvl>
+    <w:lvl w:ilvl="7" w:tentative="1">
+      <w:start w:val="1"/>
+      <w:numFmt w:val="bullet"/>
+      <w:lvlText w:val=""/>
+      <w:lvlJc w:val="left"/>
+      <w:pPr>
+        <w:tabs>
+          <w:tab w:val="num" w:pos="5760"/>
+        </w:tabs>
+        <w:ind w:left="5760" w:hanging="360"/>
+      </w:pPr>
+      <w:rPr>
+        <w:rFonts w:ascii="Wingdings" w:hAnsi="Wingdings" w:hint="default"/>
+        <w:sz w:val="20"/>
+      </w:rPr>
+    </w:lvl>
+    <w:lvl w:ilvl="8" w:tentative="1">
+      <w:start w:val="1"/>
+      <w:numFmt w:val="bullet"/>
+      <w:lvlText w:val=""/>
+      <w:lvlJc w:val="left"/>
+      <w:pPr>
+        <w:tabs>
+          <w:tab w:val="num" w:pos="6480"/>
+        </w:tabs>
+        <w:ind w:left="6480" w:hanging="360"/>
+      </w:pPr>
+      <w:rPr>
+        <w:rFonts w:ascii="Wingdings" w:hAnsi="Wingdings" w:hint="default"/>
+        <w:sz w:val="20"/>
+      </w:rPr>
+    </w:lvl>
+  </w:abstractNum>
+  <w:abstractNum w:abstractNumId="3" w15:restartNumberingAfterBreak="0">
+    <w:nsid w:val="36B44A95"/>
+    <w:multiLevelType w:val="multilevel"/>
+    <w:tmpl w:val="ED3C9BB6"/>
+    <w:lvl w:ilvl="0">
+      <w:start w:val="1"/>
+      <w:numFmt w:val="bullet"/>
+      <w:lvlText w:val=""/>
+      <w:lvlJc w:val="left"/>
+      <w:pPr>
+        <w:tabs>
+          <w:tab w:val="num" w:pos="720"/>
+        </w:tabs>
+        <w:ind w:left="720" w:hanging="360"/>
+      </w:pPr>
+      <w:rPr>
+        <w:rFonts w:ascii="Symbol" w:hAnsi="Symbol" w:hint="default"/>
+        <w:sz w:val="20"/>
+      </w:rPr>
+    </w:lvl>
+    <w:lvl w:ilvl="1" w:tentative="1">
+      <w:start w:val="1"/>
+      <w:numFmt w:val="bullet"/>
+      <w:lvlText w:val="o"/>
+      <w:lvlJc w:val="left"/>
+      <w:pPr>
+        <w:tabs>
+          <w:tab w:val="num" w:pos="1440"/>
+        </w:tabs>
+        <w:ind w:left="1440" w:hanging="360"/>
+      </w:pPr>
+      <w:rPr>
+        <w:rFonts w:ascii="Courier New" w:hAnsi="Courier New" w:hint="default"/>
+        <w:sz w:val="20"/>
+      </w:rPr>
+    </w:lvl>
+    <w:lvl w:ilvl="2" w:tentative="1">
+      <w:start w:val="1"/>
+      <w:numFmt w:val="bullet"/>
+      <w:lvlText w:val=""/>
+      <w:lvlJc w:val="left"/>
+      <w:pPr>
+        <w:tabs>
+          <w:tab w:val="num" w:pos="2160"/>
+        </w:tabs>
+        <w:ind w:left="2160" w:hanging="360"/>
+      </w:pPr>
+      <w:rPr>
+        <w:rFonts w:ascii="Wingdings" w:hAnsi="Wingdings" w:hint="default"/>
+        <w:sz w:val="20"/>
+      </w:rPr>
+    </w:lvl>
+    <w:lvl w:ilvl="3" w:tentative="1">
+      <w:start w:val="1"/>
+      <w:numFmt w:val="bullet"/>
+      <w:lvlText w:val=""/>
+      <w:lvlJc w:val="left"/>
+      <w:pPr>
+        <w:tabs>
+          <w:tab w:val="num" w:pos="2880"/>
+        </w:tabs>
+        <w:ind w:left="2880" w:hanging="360"/>
+      </w:pPr>
+      <w:rPr>
+        <w:rFonts w:ascii="Wingdings" w:hAnsi="Wingdings" w:hint="default"/>
+        <w:sz w:val="20"/>
+      </w:rPr>
+    </w:lvl>
+    <w:lvl w:ilvl="4" w:tentative="1">
+      <w:start w:val="1"/>
+      <w:numFmt w:val="bullet"/>
+      <w:lvlText w:val=""/>
+      <w:lvlJc w:val="left"/>
+      <w:pPr>
+        <w:tabs>
+          <w:tab w:val="num" w:pos="3600"/>
+        </w:tabs>
+        <w:ind w:left="3600" w:hanging="360"/>
+      </w:pPr>
+      <w:rPr>
+        <w:rFonts w:ascii="Wingdings" w:hAnsi="Wingdings" w:hint="default"/>
+        <w:sz w:val="20"/>
+      </w:rPr>
+    </w:lvl>
+    <w:lvl w:ilvl="5" w:tentative="1">
+      <w:start w:val="1"/>
+      <w:numFmt w:val="bullet"/>
+      <w:lvlText w:val=""/>
+      <w:lvlJc w:val="left"/>
+      <w:pPr>
+        <w:tabs>
+          <w:tab w:val="num" w:pos="4320"/>
+        </w:tabs>
+        <w:ind w:left="4320" w:hanging="360"/>
+      </w:pPr>
+      <w:rPr>
+        <w:rFonts w:ascii="Wingdings" w:hAnsi="Wingdings" w:hint="default"/>
+        <w:sz w:val="20"/>
+      </w:rPr>
+    </w:lvl>
+    <w:lvl w:ilvl="6" w:tentative="1">
+      <w:start w:val="1"/>
+      <w:numFmt w:val="bullet"/>
+      <w:lvlText w:val=""/>
+      <w:lvlJc w:val="left"/>
+      <w:pPr>
+        <w:tabs>
+          <w:tab w:val="num" w:pos="5040"/>
+        </w:tabs>
+        <w:ind w:left="5040" w:hanging="360"/>
+      </w:pPr>
+      <w:rPr>
+        <w:rFonts w:ascii="Wingdings" w:hAnsi="Wingdings" w:hint="default"/>
+        <w:sz w:val="20"/>
+      </w:rPr>
+    </w:lvl>
+    <w:lvl w:ilvl="7" w:tentative="1">
+      <w:start w:val="1"/>
+      <w:numFmt w:val="bullet"/>
+      <w:lvlText w:val=""/>
+      <w:lvlJc w:val="left"/>
+      <w:pPr>
+        <w:tabs>
+          <w:tab w:val="num" w:pos="5760"/>
+        </w:tabs>
+        <w:ind w:left="5760" w:hanging="360"/>
+      </w:pPr>
+      <w:rPr>
+        <w:rFonts w:ascii="Wingdings" w:hAnsi="Wingdings" w:hint="default"/>
+        <w:sz w:val="20"/>
+      </w:rPr>
+    </w:lvl>
+    <w:lvl w:ilvl="8" w:tentative="1">
+      <w:start w:val="1"/>
+      <w:numFmt w:val="bullet"/>
+      <w:lvlText w:val=""/>
+      <w:lvlJc w:val="left"/>
+      <w:pPr>
+        <w:tabs>
+          <w:tab w:val="num" w:pos="6480"/>
+        </w:tabs>
+        <w:ind w:left="6480" w:hanging="360"/>
+      </w:pPr>
+      <w:rPr>
+        <w:rFonts w:ascii="Wingdings" w:hAnsi="Wingdings" w:hint="default"/>
+        <w:sz w:val="20"/>
+      </w:rPr>
+    </w:lvl>
+  </w:abstractNum>
+  <w:abstractNum w:abstractNumId="4" w15:restartNumberingAfterBreak="0">
     <w:nsid w:val="40FB1541"/>
     <w:multiLevelType w:val="multilevel"/>
     <w:tmpl w:val="186A08F2"/>
@@ -173,7 +2063,603 @@
       </w:pPr>
     </w:lvl>
   </w:abstractNum>
-  <w:abstractNum w:abstractNumId="1" w15:restartNumberingAfterBreak="0">
+  <w:abstractNum w:abstractNumId="5" w15:restartNumberingAfterBreak="0">
+    <w:nsid w:val="549E075B"/>
+    <w:multiLevelType w:val="multilevel"/>
+    <w:tmpl w:val="AF2A83C4"/>
+    <w:lvl w:ilvl="0">
+      <w:start w:val="1"/>
+      <w:numFmt w:val="bullet"/>
+      <w:lvlText w:val=""/>
+      <w:lvlJc w:val="left"/>
+      <w:pPr>
+        <w:tabs>
+          <w:tab w:val="num" w:pos="720"/>
+        </w:tabs>
+        <w:ind w:left="720" w:hanging="360"/>
+      </w:pPr>
+      <w:rPr>
+        <w:rFonts w:ascii="Symbol" w:hAnsi="Symbol" w:hint="default"/>
+        <w:sz w:val="20"/>
+      </w:rPr>
+    </w:lvl>
+    <w:lvl w:ilvl="1" w:tentative="1">
+      <w:start w:val="1"/>
+      <w:numFmt w:val="bullet"/>
+      <w:lvlText w:val="o"/>
+      <w:lvlJc w:val="left"/>
+      <w:pPr>
+        <w:tabs>
+          <w:tab w:val="num" w:pos="1440"/>
+        </w:tabs>
+        <w:ind w:left="1440" w:hanging="360"/>
+      </w:pPr>
+      <w:rPr>
+        <w:rFonts w:ascii="Courier New" w:hAnsi="Courier New" w:hint="default"/>
+        <w:sz w:val="20"/>
+      </w:rPr>
+    </w:lvl>
+    <w:lvl w:ilvl="2" w:tentative="1">
+      <w:start w:val="1"/>
+      <w:numFmt w:val="bullet"/>
+      <w:lvlText w:val=""/>
+      <w:lvlJc w:val="left"/>
+      <w:pPr>
+        <w:tabs>
+          <w:tab w:val="num" w:pos="2160"/>
+        </w:tabs>
+        <w:ind w:left="2160" w:hanging="360"/>
+      </w:pPr>
+      <w:rPr>
+        <w:rFonts w:ascii="Wingdings" w:hAnsi="Wingdings" w:hint="default"/>
+        <w:sz w:val="20"/>
+      </w:rPr>
+    </w:lvl>
+    <w:lvl w:ilvl="3" w:tentative="1">
+      <w:start w:val="1"/>
+      <w:numFmt w:val="bullet"/>
+      <w:lvlText w:val=""/>
+      <w:lvlJc w:val="left"/>
+      <w:pPr>
+        <w:tabs>
+          <w:tab w:val="num" w:pos="2880"/>
+        </w:tabs>
+        <w:ind w:left="2880" w:hanging="360"/>
+      </w:pPr>
+      <w:rPr>
+        <w:rFonts w:ascii="Wingdings" w:hAnsi="Wingdings" w:hint="default"/>
+        <w:sz w:val="20"/>
+      </w:rPr>
+    </w:lvl>
+    <w:lvl w:ilvl="4" w:tentative="1">
+      <w:start w:val="1"/>
+      <w:numFmt w:val="bullet"/>
+      <w:lvlText w:val=""/>
+      <w:lvlJc w:val="left"/>
+      <w:pPr>
+        <w:tabs>
+          <w:tab w:val="num" w:pos="3600"/>
+        </w:tabs>
+        <w:ind w:left="3600" w:hanging="360"/>
+      </w:pPr>
+      <w:rPr>
+        <w:rFonts w:ascii="Wingdings" w:hAnsi="Wingdings" w:hint="default"/>
+        <w:sz w:val="20"/>
+      </w:rPr>
+    </w:lvl>
+    <w:lvl w:ilvl="5" w:tentative="1">
+      <w:start w:val="1"/>
+      <w:numFmt w:val="bullet"/>
+      <w:lvlText w:val=""/>
+      <w:lvlJc w:val="left"/>
+      <w:pPr>
+        <w:tabs>
+          <w:tab w:val="num" w:pos="4320"/>
+        </w:tabs>
+        <w:ind w:left="4320" w:hanging="360"/>
+      </w:pPr>
+      <w:rPr>
+        <w:rFonts w:ascii="Wingdings" w:hAnsi="Wingdings" w:hint="default"/>
+        <w:sz w:val="20"/>
+      </w:rPr>
+    </w:lvl>
+    <w:lvl w:ilvl="6" w:tentative="1">
+      <w:start w:val="1"/>
+      <w:numFmt w:val="bullet"/>
+      <w:lvlText w:val=""/>
+      <w:lvlJc w:val="left"/>
+      <w:pPr>
+        <w:tabs>
+          <w:tab w:val="num" w:pos="5040"/>
+        </w:tabs>
+        <w:ind w:left="5040" w:hanging="360"/>
+      </w:pPr>
+      <w:rPr>
+        <w:rFonts w:ascii="Wingdings" w:hAnsi="Wingdings" w:hint="default"/>
+        <w:sz w:val="20"/>
+      </w:rPr>
+    </w:lvl>
+    <w:lvl w:ilvl="7" w:tentative="1">
+      <w:start w:val="1"/>
+      <w:numFmt w:val="bullet"/>
+      <w:lvlText w:val=""/>
+      <w:lvlJc w:val="left"/>
+      <w:pPr>
+        <w:tabs>
+          <w:tab w:val="num" w:pos="5760"/>
+        </w:tabs>
+        <w:ind w:left="5760" w:hanging="360"/>
+      </w:pPr>
+      <w:rPr>
+        <w:rFonts w:ascii="Wingdings" w:hAnsi="Wingdings" w:hint="default"/>
+        <w:sz w:val="20"/>
+      </w:rPr>
+    </w:lvl>
+    <w:lvl w:ilvl="8" w:tentative="1">
+      <w:start w:val="1"/>
+      <w:numFmt w:val="bullet"/>
+      <w:lvlText w:val=""/>
+      <w:lvlJc w:val="left"/>
+      <w:pPr>
+        <w:tabs>
+          <w:tab w:val="num" w:pos="6480"/>
+        </w:tabs>
+        <w:ind w:left="6480" w:hanging="360"/>
+      </w:pPr>
+      <w:rPr>
+        <w:rFonts w:ascii="Wingdings" w:hAnsi="Wingdings" w:hint="default"/>
+        <w:sz w:val="20"/>
+      </w:rPr>
+    </w:lvl>
+  </w:abstractNum>
+  <w:abstractNum w:abstractNumId="6" w15:restartNumberingAfterBreak="0">
+    <w:nsid w:val="5C4C128E"/>
+    <w:multiLevelType w:val="multilevel"/>
+    <w:tmpl w:val="27E6FF50"/>
+    <w:lvl w:ilvl="0">
+      <w:start w:val="1"/>
+      <w:numFmt w:val="bullet"/>
+      <w:lvlText w:val=""/>
+      <w:lvlJc w:val="left"/>
+      <w:pPr>
+        <w:tabs>
+          <w:tab w:val="num" w:pos="720"/>
+        </w:tabs>
+        <w:ind w:left="720" w:hanging="360"/>
+      </w:pPr>
+      <w:rPr>
+        <w:rFonts w:ascii="Symbol" w:hAnsi="Symbol" w:hint="default"/>
+        <w:sz w:val="20"/>
+      </w:rPr>
+    </w:lvl>
+    <w:lvl w:ilvl="1">
+      <w:start w:val="1"/>
+      <w:numFmt w:val="bullet"/>
+      <w:lvlText w:val="o"/>
+      <w:lvlJc w:val="left"/>
+      <w:pPr>
+        <w:tabs>
+          <w:tab w:val="num" w:pos="1440"/>
+        </w:tabs>
+        <w:ind w:left="1440" w:hanging="360"/>
+      </w:pPr>
+      <w:rPr>
+        <w:rFonts w:ascii="Courier New" w:hAnsi="Courier New" w:hint="default"/>
+        <w:sz w:val="20"/>
+      </w:rPr>
+    </w:lvl>
+    <w:lvl w:ilvl="2" w:tentative="1">
+      <w:start w:val="1"/>
+      <w:numFmt w:val="bullet"/>
+      <w:lvlText w:val=""/>
+      <w:lvlJc w:val="left"/>
+      <w:pPr>
+        <w:tabs>
+          <w:tab w:val="num" w:pos="2160"/>
+        </w:tabs>
+        <w:ind w:left="2160" w:hanging="360"/>
+      </w:pPr>
+      <w:rPr>
+        <w:rFonts w:ascii="Wingdings" w:hAnsi="Wingdings" w:hint="default"/>
+        <w:sz w:val="20"/>
+      </w:rPr>
+    </w:lvl>
+    <w:lvl w:ilvl="3" w:tentative="1">
+      <w:start w:val="1"/>
+      <w:numFmt w:val="bullet"/>
+      <w:lvlText w:val=""/>
+      <w:lvlJc w:val="left"/>
+      <w:pPr>
+        <w:tabs>
+          <w:tab w:val="num" w:pos="2880"/>
+        </w:tabs>
+        <w:ind w:left="2880" w:hanging="360"/>
+      </w:pPr>
+      <w:rPr>
+        <w:rFonts w:ascii="Wingdings" w:hAnsi="Wingdings" w:hint="default"/>
+        <w:sz w:val="20"/>
+      </w:rPr>
+    </w:lvl>
+    <w:lvl w:ilvl="4" w:tentative="1">
+      <w:start w:val="1"/>
+      <w:numFmt w:val="bullet"/>
+      <w:lvlText w:val=""/>
+      <w:lvlJc w:val="left"/>
+      <w:pPr>
+        <w:tabs>
+          <w:tab w:val="num" w:pos="3600"/>
+        </w:tabs>
+        <w:ind w:left="3600" w:hanging="360"/>
+      </w:pPr>
+      <w:rPr>
+        <w:rFonts w:ascii="Wingdings" w:hAnsi="Wingdings" w:hint="default"/>
+        <w:sz w:val="20"/>
+      </w:rPr>
+    </w:lvl>
+    <w:lvl w:ilvl="5" w:tentative="1">
+      <w:start w:val="1"/>
+      <w:numFmt w:val="bullet"/>
+      <w:lvlText w:val=""/>
+      <w:lvlJc w:val="left"/>
+      <w:pPr>
+        <w:tabs>
+          <w:tab w:val="num" w:pos="4320"/>
+        </w:tabs>
+        <w:ind w:left="4320" w:hanging="360"/>
+      </w:pPr>
+      <w:rPr>
+        <w:rFonts w:ascii="Wingdings" w:hAnsi="Wingdings" w:hint="default"/>
+        <w:sz w:val="20"/>
+      </w:rPr>
+    </w:lvl>
+    <w:lvl w:ilvl="6" w:tentative="1">
+      <w:start w:val="1"/>
+      <w:numFmt w:val="bullet"/>
+      <w:lvlText w:val=""/>
+      <w:lvlJc w:val="left"/>
+      <w:pPr>
+        <w:tabs>
+          <w:tab w:val="num" w:pos="5040"/>
+        </w:tabs>
+        <w:ind w:left="5040" w:hanging="360"/>
+      </w:pPr>
+      <w:rPr>
+        <w:rFonts w:ascii="Wingdings" w:hAnsi="Wingdings" w:hint="default"/>
+        <w:sz w:val="20"/>
+      </w:rPr>
+    </w:lvl>
+    <w:lvl w:ilvl="7" w:tentative="1">
+      <w:start w:val="1"/>
+      <w:numFmt w:val="bullet"/>
+      <w:lvlText w:val=""/>
+      <w:lvlJc w:val="left"/>
+      <w:pPr>
+        <w:tabs>
+          <w:tab w:val="num" w:pos="5760"/>
+        </w:tabs>
+        <w:ind w:left="5760" w:hanging="360"/>
+      </w:pPr>
+      <w:rPr>
+        <w:rFonts w:ascii="Wingdings" w:hAnsi="Wingdings" w:hint="default"/>
+        <w:sz w:val="20"/>
+      </w:rPr>
+    </w:lvl>
+    <w:lvl w:ilvl="8" w:tentative="1">
+      <w:start w:val="1"/>
+      <w:numFmt w:val="bullet"/>
+      <w:lvlText w:val=""/>
+      <w:lvlJc w:val="left"/>
+      <w:pPr>
+        <w:tabs>
+          <w:tab w:val="num" w:pos="6480"/>
+        </w:tabs>
+        <w:ind w:left="6480" w:hanging="360"/>
+      </w:pPr>
+      <w:rPr>
+        <w:rFonts w:ascii="Wingdings" w:hAnsi="Wingdings" w:hint="default"/>
+        <w:sz w:val="20"/>
+      </w:rPr>
+    </w:lvl>
+  </w:abstractNum>
+  <w:abstractNum w:abstractNumId="7" w15:restartNumberingAfterBreak="0">
+    <w:nsid w:val="6A034656"/>
+    <w:multiLevelType w:val="multilevel"/>
+    <w:tmpl w:val="26FC1F1E"/>
+    <w:lvl w:ilvl="0">
+      <w:start w:val="1"/>
+      <w:numFmt w:val="bullet"/>
+      <w:lvlText w:val=""/>
+      <w:lvlJc w:val="left"/>
+      <w:pPr>
+        <w:tabs>
+          <w:tab w:val="num" w:pos="720"/>
+        </w:tabs>
+        <w:ind w:left="720" w:hanging="360"/>
+      </w:pPr>
+      <w:rPr>
+        <w:rFonts w:ascii="Symbol" w:hAnsi="Symbol" w:hint="default"/>
+        <w:sz w:val="20"/>
+      </w:rPr>
+    </w:lvl>
+    <w:lvl w:ilvl="1" w:tentative="1">
+      <w:start w:val="1"/>
+      <w:numFmt w:val="bullet"/>
+      <w:lvlText w:val="o"/>
+      <w:lvlJc w:val="left"/>
+      <w:pPr>
+        <w:tabs>
+          <w:tab w:val="num" w:pos="1440"/>
+        </w:tabs>
+        <w:ind w:left="1440" w:hanging="360"/>
+      </w:pPr>
+      <w:rPr>
+        <w:rFonts w:ascii="Courier New" w:hAnsi="Courier New" w:hint="default"/>
+        <w:sz w:val="20"/>
+      </w:rPr>
+    </w:lvl>
+    <w:lvl w:ilvl="2" w:tentative="1">
+      <w:start w:val="1"/>
+      <w:numFmt w:val="bullet"/>
+      <w:lvlText w:val=""/>
+      <w:lvlJc w:val="left"/>
+      <w:pPr>
+        <w:tabs>
+          <w:tab w:val="num" w:pos="2160"/>
+        </w:tabs>
+        <w:ind w:left="2160" w:hanging="360"/>
+      </w:pPr>
+      <w:rPr>
+        <w:rFonts w:ascii="Wingdings" w:hAnsi="Wingdings" w:hint="default"/>
+        <w:sz w:val="20"/>
+      </w:rPr>
+    </w:lvl>
+    <w:lvl w:ilvl="3" w:tentative="1">
+      <w:start w:val="1"/>
+      <w:numFmt w:val="bullet"/>
+      <w:lvlText w:val=""/>
+      <w:lvlJc w:val="left"/>
+      <w:pPr>
+        <w:tabs>
+          <w:tab w:val="num" w:pos="2880"/>
+        </w:tabs>
+        <w:ind w:left="2880" w:hanging="360"/>
+      </w:pPr>
+      <w:rPr>
+        <w:rFonts w:ascii="Wingdings" w:hAnsi="Wingdings" w:hint="default"/>
+        <w:sz w:val="20"/>
+      </w:rPr>
+    </w:lvl>
+    <w:lvl w:ilvl="4" w:tentative="1">
+      <w:start w:val="1"/>
+      <w:numFmt w:val="bullet"/>
+      <w:lvlText w:val=""/>
+      <w:lvlJc w:val="left"/>
+      <w:pPr>
+        <w:tabs>
+          <w:tab w:val="num" w:pos="3600"/>
+        </w:tabs>
+        <w:ind w:left="3600" w:hanging="360"/>
+      </w:pPr>
+      <w:rPr>
+        <w:rFonts w:ascii="Wingdings" w:hAnsi="Wingdings" w:hint="default"/>
+        <w:sz w:val="20"/>
+      </w:rPr>
+    </w:lvl>
+    <w:lvl w:ilvl="5" w:tentative="1">
+      <w:start w:val="1"/>
+      <w:numFmt w:val="bullet"/>
+      <w:lvlText w:val=""/>
+      <w:lvlJc w:val="left"/>
+      <w:pPr>
+        <w:tabs>
+          <w:tab w:val="num" w:pos="4320"/>
+        </w:tabs>
+        <w:ind w:left="4320" w:hanging="360"/>
+      </w:pPr>
+      <w:rPr>
+        <w:rFonts w:ascii="Wingdings" w:hAnsi="Wingdings" w:hint="default"/>
+        <w:sz w:val="20"/>
+      </w:rPr>
+    </w:lvl>
+    <w:lvl w:ilvl="6" w:tentative="1">
+      <w:start w:val="1"/>
+      <w:numFmt w:val="bullet"/>
+      <w:lvlText w:val=""/>
+      <w:lvlJc w:val="left"/>
+      <w:pPr>
+        <w:tabs>
+          <w:tab w:val="num" w:pos="5040"/>
+        </w:tabs>
+        <w:ind w:left="5040" w:hanging="360"/>
+      </w:pPr>
+      <w:rPr>
+        <w:rFonts w:ascii="Wingdings" w:hAnsi="Wingdings" w:hint="default"/>
+        <w:sz w:val="20"/>
+      </w:rPr>
+    </w:lvl>
+    <w:lvl w:ilvl="7" w:tentative="1">
+      <w:start w:val="1"/>
+      <w:numFmt w:val="bullet"/>
+      <w:lvlText w:val=""/>
+      <w:lvlJc w:val="left"/>
+      <w:pPr>
+        <w:tabs>
+          <w:tab w:val="num" w:pos="5760"/>
+        </w:tabs>
+        <w:ind w:left="5760" w:hanging="360"/>
+      </w:pPr>
+      <w:rPr>
+        <w:rFonts w:ascii="Wingdings" w:hAnsi="Wingdings" w:hint="default"/>
+        <w:sz w:val="20"/>
+      </w:rPr>
+    </w:lvl>
+    <w:lvl w:ilvl="8" w:tentative="1">
+      <w:start w:val="1"/>
+      <w:numFmt w:val="bullet"/>
+      <w:lvlText w:val=""/>
+      <w:lvlJc w:val="left"/>
+      <w:pPr>
+        <w:tabs>
+          <w:tab w:val="num" w:pos="6480"/>
+        </w:tabs>
+        <w:ind w:left="6480" w:hanging="360"/>
+      </w:pPr>
+      <w:rPr>
+        <w:rFonts w:ascii="Wingdings" w:hAnsi="Wingdings" w:hint="default"/>
+        <w:sz w:val="20"/>
+      </w:rPr>
+    </w:lvl>
+  </w:abstractNum>
+  <w:abstractNum w:abstractNumId="8" w15:restartNumberingAfterBreak="0">
+    <w:nsid w:val="6BA73411"/>
+    <w:multiLevelType w:val="multilevel"/>
+    <w:tmpl w:val="4CC0D5E0"/>
+    <w:lvl w:ilvl="0">
+      <w:start w:val="1"/>
+      <w:numFmt w:val="bullet"/>
+      <w:lvlText w:val=""/>
+      <w:lvlJc w:val="left"/>
+      <w:pPr>
+        <w:tabs>
+          <w:tab w:val="num" w:pos="720"/>
+        </w:tabs>
+        <w:ind w:left="720" w:hanging="360"/>
+      </w:pPr>
+      <w:rPr>
+        <w:rFonts w:ascii="Symbol" w:hAnsi="Symbol" w:hint="default"/>
+        <w:sz w:val="20"/>
+      </w:rPr>
+    </w:lvl>
+    <w:lvl w:ilvl="1" w:tentative="1">
+      <w:start w:val="1"/>
+      <w:numFmt w:val="bullet"/>
+      <w:lvlText w:val="o"/>
+      <w:lvlJc w:val="left"/>
+      <w:pPr>
+        <w:tabs>
+          <w:tab w:val="num" w:pos="1440"/>
+        </w:tabs>
+        <w:ind w:left="1440" w:hanging="360"/>
+      </w:pPr>
+      <w:rPr>
+        <w:rFonts w:ascii="Courier New" w:hAnsi="Courier New" w:hint="default"/>
+        <w:sz w:val="20"/>
+      </w:rPr>
+    </w:lvl>
+    <w:lvl w:ilvl="2" w:tentative="1">
+      <w:start w:val="1"/>
+      <w:numFmt w:val="bullet"/>
+      <w:lvlText w:val=""/>
+      <w:lvlJc w:val="left"/>
+      <w:pPr>
+        <w:tabs>
+          <w:tab w:val="num" w:pos="2160"/>
+        </w:tabs>
+        <w:ind w:left="2160" w:hanging="360"/>
+      </w:pPr>
+      <w:rPr>
+        <w:rFonts w:ascii="Wingdings" w:hAnsi="Wingdings" w:hint="default"/>
+        <w:sz w:val="20"/>
+      </w:rPr>
+    </w:lvl>
+    <w:lvl w:ilvl="3" w:tentative="1">
+      <w:start w:val="1"/>
+      <w:numFmt w:val="bullet"/>
+      <w:lvlText w:val=""/>
+      <w:lvlJc w:val="left"/>
+      <w:pPr>
+        <w:tabs>
+          <w:tab w:val="num" w:pos="2880"/>
+        </w:tabs>
+        <w:ind w:left="2880" w:hanging="360"/>
+      </w:pPr>
+      <w:rPr>
+        <w:rFonts w:ascii="Wingdings" w:hAnsi="Wingdings" w:hint="default"/>
+        <w:sz w:val="20"/>
+      </w:rPr>
+    </w:lvl>
+    <w:lvl w:ilvl="4" w:tentative="1">
+      <w:start w:val="1"/>
+      <w:numFmt w:val="bullet"/>
+      <w:lvlText w:val=""/>
+      <w:lvlJc w:val="left"/>
+      <w:pPr>
+        <w:tabs>
+          <w:tab w:val="num" w:pos="3600"/>
+        </w:tabs>
+        <w:ind w:left="3600" w:hanging="360"/>
+      </w:pPr>
+      <w:rPr>
+        <w:rFonts w:ascii="Wingdings" w:hAnsi="Wingdings" w:hint="default"/>
+        <w:sz w:val="20"/>
+      </w:rPr>
+    </w:lvl>
+    <w:lvl w:ilvl="5" w:tentative="1">
+      <w:start w:val="1"/>
+      <w:numFmt w:val="bullet"/>
+      <w:lvlText w:val=""/>
+      <w:lvlJc w:val="left"/>
+      <w:pPr>
+        <w:tabs>
+          <w:tab w:val="num" w:pos="4320"/>
+        </w:tabs>
+        <w:ind w:left="4320" w:hanging="360"/>
+      </w:pPr>
+      <w:rPr>
+        <w:rFonts w:ascii="Wingdings" w:hAnsi="Wingdings" w:hint="default"/>
+        <w:sz w:val="20"/>
+      </w:rPr>
+    </w:lvl>
+    <w:lvl w:ilvl="6" w:tentative="1">
+      <w:start w:val="1"/>
+      <w:numFmt w:val="bullet"/>
+      <w:lvlText w:val=""/>
+      <w:lvlJc w:val="left"/>
+      <w:pPr>
+        <w:tabs>
+          <w:tab w:val="num" w:pos="5040"/>
+        </w:tabs>
+        <w:ind w:left="5040" w:hanging="360"/>
+      </w:pPr>
+      <w:rPr>
+        <w:rFonts w:ascii="Wingdings" w:hAnsi="Wingdings" w:hint="default"/>
+        <w:sz w:val="20"/>
+      </w:rPr>
+    </w:lvl>
+    <w:lvl w:ilvl="7" w:tentative="1">
+      <w:start w:val="1"/>
+      <w:numFmt w:val="bullet"/>
+      <w:lvlText w:val=""/>
+      <w:lvlJc w:val="left"/>
+      <w:pPr>
+        <w:tabs>
+          <w:tab w:val="num" w:pos="5760"/>
+        </w:tabs>
+        <w:ind w:left="5760" w:hanging="360"/>
+      </w:pPr>
+      <w:rPr>
+        <w:rFonts w:ascii="Wingdings" w:hAnsi="Wingdings" w:hint="default"/>
+        <w:sz w:val="20"/>
+      </w:rPr>
+    </w:lvl>
+    <w:lvl w:ilvl="8" w:tentative="1">
+      <w:start w:val="1"/>
+      <w:numFmt w:val="bullet"/>
+      <w:lvlText w:val=""/>
+      <w:lvlJc w:val="left"/>
+      <w:pPr>
+        <w:tabs>
+          <w:tab w:val="num" w:pos="6480"/>
+        </w:tabs>
+        <w:ind w:left="6480" w:hanging="360"/>
+      </w:pPr>
+      <w:rPr>
+        <w:rFonts w:ascii="Wingdings" w:hAnsi="Wingdings" w:hint="default"/>
+        <w:sz w:val="20"/>
+      </w:rPr>
+    </w:lvl>
+  </w:abstractNum>
+  <w:abstractNum w:abstractNumId="9" w15:restartNumberingAfterBreak="0">
     <w:nsid w:val="78314B94"/>
     <w:multiLevelType w:val="multilevel"/>
     <w:tmpl w:val="3D540FEA"/>
@@ -287,10 +2773,34 @@
     </w:lvl>
   </w:abstractNum>
   <w:num w:numId="1" w16cid:durableId="1995331633">
+    <w:abstractNumId w:val="9"/>
+  </w:num>
+  <w:num w:numId="2" w16cid:durableId="1173447243">
+    <w:abstractNumId w:val="4"/>
+  </w:num>
+  <w:num w:numId="3" w16cid:durableId="355813761">
+    <w:abstractNumId w:val="7"/>
+  </w:num>
+  <w:num w:numId="4" w16cid:durableId="773944298">
+    <w:abstractNumId w:val="0"/>
+  </w:num>
+  <w:num w:numId="5" w16cid:durableId="538325705">
     <w:abstractNumId w:val="1"/>
   </w:num>
-  <w:num w:numId="2" w16cid:durableId="1173447243">
-    <w:abstractNumId w:val="0"/>
+  <w:num w:numId="6" w16cid:durableId="1015308008">
+    <w:abstractNumId w:val="8"/>
+  </w:num>
+  <w:num w:numId="7" w16cid:durableId="275911299">
+    <w:abstractNumId w:val="2"/>
+  </w:num>
+  <w:num w:numId="8" w16cid:durableId="422184802">
+    <w:abstractNumId w:val="6"/>
+  </w:num>
+  <w:num w:numId="9" w16cid:durableId="1284843219">
+    <w:abstractNumId w:val="5"/>
+  </w:num>
+  <w:num w:numId="10" w16cid:durableId="378214047">
+    <w:abstractNumId w:val="3"/>
   </w:num>
 </w:numbering>
 </file>
@@ -1211,6 +3721,40 @@
       <w:spacing w:val="5"/>
     </w:rPr>
   </w:style>
+  <w:style w:type="paragraph" w:styleId="NormalWeb">
+    <w:name w:val="Normal (Web)"/>
+    <w:basedOn w:val="Normal"/>
+    <w:uiPriority w:val="99"/>
+    <w:semiHidden/>
+    <w:unhideWhenUsed/>
+    <w:rsid w:val="00FD07FB"/>
+    <w:rPr>
+      <w:rFonts w:ascii="Times New Roman" w:hAnsi="Times New Roman" w:cs="Times New Roman"/>
+    </w:rPr>
+  </w:style>
+  <w:style w:type="character" w:styleId="Hyperlink">
+    <w:name w:val="Hyperlink"/>
+    <w:basedOn w:val="DefaultParagraphFont"/>
+    <w:uiPriority w:val="99"/>
+    <w:unhideWhenUsed/>
+    <w:rsid w:val="00FD07FB"/>
+    <w:rPr>
+      <w:color w:val="467886" w:themeColor="hyperlink"/>
+      <w:u w:val="single"/>
+    </w:rPr>
+  </w:style>
+  <w:style w:type="character" w:styleId="UnresolvedMention">
+    <w:name w:val="Unresolved Mention"/>
+    <w:basedOn w:val="DefaultParagraphFont"/>
+    <w:uiPriority w:val="99"/>
+    <w:semiHidden/>
+    <w:unhideWhenUsed/>
+    <w:rsid w:val="00FD07FB"/>
+    <w:rPr>
+      <w:color w:val="605E5C"/>
+      <w:shd w:val="clear" w:color="auto" w:fill="E1DFDD"/>
+    </w:rPr>
+  </w:style>
 </w:styles>
 </file>
 

</xml_diff>